<commit_message>
Paso el manual de usuario al tuteo, como la interfaz
</commit_message>
<xml_diff>
--- a/docs/manuales/INVENTRA_Manual_de_Usuario.docx
+++ b/docs/manuales/INVENTRA_Manual_de_Usuario.docx
@@ -145,7 +145,7 @@
           <w:left w:w="10" w:type="dxa"/>
           <w:right w:w="10" w:type="dxa"/>
         </w:tblCellMar>
-        <w:tblLook w:val="0000" w:firstRow="0" w:lastRow="0" w:firstColumn="0" w:lastColumn="0" w:noHBand="0" w:noVBand="0"/>
+        <w:tblLook w:val="04A0" w:firstRow="1" w:lastRow="0" w:firstColumn="1" w:lastColumn="0" w:noHBand="0" w:noVBand="1"/>
       </w:tblPr>
       <w:tblGrid>
         <w:gridCol w:w="1500"/>
@@ -587,7 +587,7 @@
             <w:sz w:val="20"/>
             <w:szCs w:val="20"/>
           </w:rPr>
-          <w:t>2.1 Qué necesita</w:t>
+          <w:t>2.1 Qué necesitas</w:t>
         </w:r>
       </w:hyperlink>
       <w:r>
@@ -676,7 +676,7 @@
             <w:sz w:val="21"/>
             <w:szCs w:val="21"/>
           </w:rPr>
-          <w:t>3. Crear la cuenta de su licorera</w:t>
+          <w:t>3. Crear la cuenta de tu licorera</w:t>
         </w:r>
       </w:hyperlink>
       <w:r>
@@ -809,7 +809,7 @@
             <w:sz w:val="20"/>
             <w:szCs w:val="20"/>
           </w:rPr>
-          <w:t>4.2 Si se equivoca de contraseña</w:t>
+          <w:t>4.2 Si te equivocas de contraseña</w:t>
         </w:r>
       </w:hyperlink>
       <w:r>
@@ -944,7 +944,7 @@
             <w:sz w:val="21"/>
             <w:szCs w:val="21"/>
           </w:rPr>
-          <w:t>7. Los usuarios de su licorera</w:t>
+          <w:t>7. Los usuarios de tu licorera</w:t>
         </w:r>
       </w:hyperlink>
       <w:r>
@@ -1209,7 +1209,7 @@
             <w:sz w:val="21"/>
             <w:szCs w:val="21"/>
           </w:rPr>
-          <w:t>8. Su perfil</w:t>
+          <w:t>8. Tu perfil</w:t>
         </w:r>
       </w:hyperlink>
       <w:r>
@@ -1253,7 +1253,7 @@
             <w:sz w:val="20"/>
             <w:szCs w:val="20"/>
           </w:rPr>
-          <w:t>8.1 Cambiar su nombre o su teléfono</w:t>
+          <w:t>8.1 Cambiar tu nombre o tu teléfono</w:t>
         </w:r>
       </w:hyperlink>
       <w:r>
@@ -1297,7 +1297,7 @@
             <w:sz w:val="20"/>
             <w:szCs w:val="20"/>
           </w:rPr>
-          <w:t>8.2 Cambiar su contraseña</w:t>
+          <w:t>8.2 Cambiar tu contraseña</w:t>
         </w:r>
       </w:hyperlink>
       <w:r>
@@ -1341,7 +1341,7 @@
             <w:sz w:val="20"/>
             <w:szCs w:val="20"/>
           </w:rPr>
-          <w:t>8.3 Lo que no puede cambiar usted</w:t>
+          <w:t>8.3 Lo que no puedes cambiar tú</w:t>
         </w:r>
       </w:hyperlink>
       <w:r>
@@ -1559,7 +1559,7 @@
         <w:jc w:val="both"/>
       </w:pPr>
       <w:r>
-        <w:t>Cada apartado corresponde a una pantalla y sigue el mismo orden: primero la imagen de la pantalla, después los pasos numerados y, al final, las advertencias que conviene tener presentes. Si solo necesita resolver una duda puntual, el apartado 9 reúne todos los mensajes que el sistema puede mostrarle y qué significa cada uno.</w:t>
+        <w:t>Cada apartado corresponde a una pantalla y sigue el mismo orden: primero la imagen de la pantalla, después los pasos numerados y, al final, las advertencias que conviene tener presentes. Si solo necesitas resolver una duda puntual, el apartado 9 reúne todos los mensajes que el sistema puede mostrarte y qué significa cada uno.</w:t>
       </w:r>
     </w:p>
     <w:p>
@@ -1596,7 +1596,7 @@
           <w:sz w:val="23"/>
           <w:szCs w:val="23"/>
         </w:rPr>
-        <w:t>2.1 Qué necesita</w:t>
+        <w:t>2.1 Qué necesitas</w:t>
       </w:r>
       <w:bookmarkEnd w:id="4"/>
     </w:p>
@@ -1636,7 +1636,7 @@
         <w:spacing w:after="60" w:line="258" w:lineRule="auto"/>
       </w:pPr>
       <w:r>
-        <w:t>La dirección web de INVENTRA, y un correo electrónico al que tenga acceso.</w:t>
+        <w:t>La dirección web de INVENTRA, y un correo electrónico al que tengas acceso.</w:t>
       </w:r>
     </w:p>
     <w:p>
@@ -1645,7 +1645,7 @@
         <w:jc w:val="both"/>
       </w:pPr>
       <w:r>
-        <w:t>El correo es importante: es con lo que entra al sistema y es a donde llega el enlace si algún día olvida la contraseña. Use uno suyo, al que entre con frecuencia.</w:t>
+        <w:t>El correo es importante: es con lo que entras al sistema y es a donde llega el enlace si algún día olvidas la contraseña. Usa uno tuyo, al que entres con frecuencia.</w:t>
       </w:r>
     </w:p>
     <w:p>
@@ -1691,7 +1691,7 @@
           <w:left w:w="10" w:type="dxa"/>
           <w:right w:w="10" w:type="dxa"/>
         </w:tblCellMar>
-        <w:tblLook w:val="0000" w:firstRow="0" w:lastRow="0" w:firstColumn="0" w:lastColumn="0" w:noHBand="0" w:noVBand="0"/>
+        <w:tblLook w:val="04A0" w:firstRow="1" w:lastRow="0" w:firstColumn="1" w:lastColumn="0" w:noHBand="0" w:noVBand="1"/>
       </w:tblPr>
       <w:tblGrid>
         <w:gridCol w:w="2600"/>
@@ -1900,7 +1900,7 @@
           <w:szCs w:val="27"/>
         </w:rPr>
         <w:lastRenderedPageBreak/>
-        <w:t>3. Crear la cuenta de su licorera</w:t>
+        <w:t>3. Crear la cuenta de tu licorera</w:t>
       </w:r>
       <w:bookmarkEnd w:id="6"/>
     </w:p>
@@ -1910,7 +1910,7 @@
         <w:jc w:val="both"/>
       </w:pPr>
       <w:r>
-        <w:t>Este paso se hace una sola vez, cuando el negocio empieza a usar INVENTRA. Si su licorera ya está registrada y usted es un empleado, no use esta pantalla: pídale al administrador que le cree la cuenta (apartado 7.2).</w:t>
+        <w:t>Este paso se hace una sola vez, cuando el negocio empieza a usar INVENTRA. Si tu licorera ya está registrada y eres un empleado, no uses esta pantalla: pídele al administrador que te cree la cuenta (apartado 7.2).</w:t>
       </w:r>
     </w:p>
     <w:p>
@@ -1923,7 +1923,7 @@
           <w:noProof/>
         </w:rPr>
         <w:drawing>
-          <wp:inline distT="0" distB="0" distL="0" distR="0" wp14:anchorId="267B0834" wp14:editId="58F66B63">
+          <wp:inline distT="0" distB="0" distL="0" distR="0" wp14:anchorId="0429CE4C" wp14:editId="52DBE54B">
             <wp:extent cx="3619500" cy="2809875"/>
             <wp:effectExtent l="0" t="0" r="0" b="0"/>
             <wp:docPr id="1" name="Imagen 1"/>
@@ -1988,7 +1988,7 @@
         <w:spacing w:after="60" w:line="258" w:lineRule="auto"/>
       </w:pPr>
       <w:r>
-        <w:t xml:space="preserve">En la pantalla de inicio de sesión, pulse </w:t>
+        <w:t xml:space="preserve">En la pantalla de inicio de sesión, pulsa </w:t>
       </w:r>
       <w:r>
         <w:rPr>
@@ -2011,7 +2011,7 @@
         <w:spacing w:after="60" w:line="258" w:lineRule="auto"/>
       </w:pPr>
       <w:r>
-        <w:t xml:space="preserve">Escriba el </w:t>
+        <w:t xml:space="preserve">Escribe el </w:t>
       </w:r>
       <w:r>
         <w:rPr>
@@ -2021,7 +2021,7 @@
         <w:t>nombre del negocio</w:t>
       </w:r>
       <w:r>
-        <w:t xml:space="preserve"> tal como quiere que aparezca en el sistema.</w:t>
+        <w:t xml:space="preserve"> tal como quieras que aparezca en el sistema.</w:t>
       </w:r>
     </w:p>
     <w:p>
@@ -2034,7 +2034,7 @@
         <w:spacing w:after="60" w:line="258" w:lineRule="auto"/>
       </w:pPr>
       <w:r>
-        <w:t xml:space="preserve">Escriba su </w:t>
+        <w:t xml:space="preserve">Escribe tu </w:t>
       </w:r>
       <w:r>
         <w:rPr>
@@ -2044,7 +2044,7 @@
         <w:t>nombre y apellido</w:t>
       </w:r>
       <w:r>
-        <w:t xml:space="preserve">, su </w:t>
+        <w:t xml:space="preserve">, tu </w:t>
       </w:r>
       <w:r>
         <w:rPr>
@@ -2077,7 +2077,7 @@
         <w:spacing w:after="60" w:line="258" w:lineRule="auto"/>
       </w:pPr>
       <w:r>
-        <w:t xml:space="preserve">Pulse </w:t>
+        <w:t xml:space="preserve">Pulsa </w:t>
       </w:r>
       <w:r>
         <w:rPr>
@@ -2087,7 +2087,7 @@
         <w:t>Crear cuenta</w:t>
       </w:r>
       <w:r>
-        <w:t>. Entrará directamente al sistema, sin tener que iniciar sesión otra vez.</w:t>
+        <w:t>. Entrarás directamente al sistema, sin tener que iniciar sesión otra vez.</w:t>
       </w:r>
     </w:p>
     <w:p>
@@ -2119,7 +2119,7 @@
         <w:t xml:space="preserve">Si el correo ya está registrado, </w:t>
       </w:r>
       <w:r>
-        <w:t>el sistema se lo indicará debajo de ese campo. Cada correo pertenece a una sola cuenta en toda la plataforma.</w:t>
+        <w:t>el sistema te lo indicará debajo de ese campo. Cada correo pertenece a una sola cuenta en toda la plataforma.</w:t>
       </w:r>
     </w:p>
     <w:p>
@@ -2135,7 +2135,7 @@
         <w:t xml:space="preserve">Los primeros quince días son de prueba. </w:t>
       </w:r>
       <w:r>
-        <w:t>Al crear la cuenta, su licorera empieza un período de prueba gratuito de quince días con todas las funciones disponibles. En el panel principal verá cuántos días le quedan. Si al terminar no ha contratado un plan, su información se conserva y la podrá seguir consultando, pero el sistema dejará de admitir registros nuevos hasta que contrate.</w:t>
+        <w:t>Al crear la cuenta, tu licorera empieza un período de prueba gratuito de quince días con todas las funciones disponibles. En el panel principal verás cuántos días te quedan. Si al terminar no has contratado un plan, tu información se conserva y la podrás seguir consultando, pero el sistema dejará de admitir registros nuevos hasta que contrates.</w:t>
       </w:r>
     </w:p>
     <w:p>
@@ -2148,10 +2148,10 @@
           <w:b/>
           <w:bCs/>
         </w:rPr>
-        <w:t xml:space="preserve">Verifique su correo. </w:t>
-      </w:r>
-      <w:r>
-        <w:t>Al registrarse recibirá un mensaje con un enlace. Mientras no lo abra, podrá trabajar con normalidad, pero verá un aviso recordándoselo. Conviene hacerlo pronto: ese correo es el que le permitirá recuperar su contraseña si algún día la olvida, y por eso el sistema necesita comprobar que es suyo.</w:t>
+        <w:t xml:space="preserve">Verifica tu correo. </w:t>
+      </w:r>
+      <w:r>
+        <w:t>Al registrarte recibirás un mensaje con un enlace. Mientras no lo abras, podrás trabajar con normalidad, pero verás un aviso recordándotelo. Conviene hacerlo pronto: ese correo es el que te permitirá recuperar tu contraseña si algún día la olvidas, y por eso el sistema necesita comprobar que es tuyo.</w:t>
       </w:r>
     </w:p>
     <w:p>
@@ -2184,10 +2184,10 @@
           <w:noProof/>
         </w:rPr>
         <w:drawing>
-          <wp:inline distT="0" distB="0" distL="0" distR="0" wp14:anchorId="00828D29" wp14:editId="2B6E095B">
+          <wp:inline distT="0" distB="0" distL="0" distR="0" wp14:anchorId="58F8441D" wp14:editId="4759EC85">
             <wp:extent cx="3619500" cy="2438400"/>
             <wp:effectExtent l="0" t="0" r="0" b="0"/>
-            <wp:docPr id="83827546" name="Imagen 83827546"/>
+            <wp:docPr id="693875561" name="Imagen 693875561"/>
             <wp:cNvGraphicFramePr>
               <a:graphicFrameLocks xmlns:a="http://schemas.openxmlformats.org/drawingml/2006/main" noChangeAspect="1"/>
             </wp:cNvGraphicFramePr>
@@ -2249,7 +2249,7 @@
         <w:spacing w:after="60" w:line="258" w:lineRule="auto"/>
       </w:pPr>
       <w:r>
-        <w:t>Escriba su correo electrónico y su contraseña.</w:t>
+        <w:t>Escribe tu correo electrónico y tu contraseña.</w:t>
       </w:r>
     </w:p>
     <w:p>
@@ -2262,7 +2262,7 @@
         <w:spacing w:after="60" w:line="258" w:lineRule="auto"/>
       </w:pPr>
       <w:r>
-        <w:t xml:space="preserve">Pulse </w:t>
+        <w:t xml:space="preserve">Pulsa </w:t>
       </w:r>
       <w:r>
         <w:rPr>
@@ -2299,7 +2299,7 @@
         <w:jc w:val="both"/>
       </w:pPr>
       <w:r>
-        <w:t>Esa casilla decide cuánto dura su sesión. Si la marca, seguirá dentro aunque cierre el navegador y lo vuelva a abrir. Si no la marca, la sesión se cierra al cerrar la pestaña.</w:t>
+        <w:t>Esa casilla decide cuánto dura tu sesión. Si la marcas, seguirás dentro aunque cierres el navegador y lo vuelvas a abrir. Si no la marcas, la sesión se cierra al cerrar la pestaña.</w:t>
       </w:r>
     </w:p>
     <w:p>
@@ -2315,7 +2315,7 @@
         <w:t xml:space="preserve">Recomendación: </w:t>
       </w:r>
       <w:r>
-        <w:t>márquela solo en su computador personal. En un equipo compartido —el del mostrador, por ejemplo— déjela sin marcar.</w:t>
+        <w:t>márcala solo en tu computador personal. En un equipo compartido —el del mostrador, por ejemplo— déjala sin marcar.</w:t>
       </w:r>
     </w:p>
     <w:p>
@@ -2332,7 +2332,7 @@
           <w:sz w:val="23"/>
           <w:szCs w:val="23"/>
         </w:rPr>
-        <w:t>4.2 Si se equivoca de contraseña</w:t>
+        <w:t>4.2 Si te equivocas de contraseña</w:t>
       </w:r>
       <w:bookmarkEnd w:id="9"/>
     </w:p>
@@ -2358,7 +2358,7 @@
         <w:t>Tras cinco intentos fallidos la cuenta se bloquea durante quince minutos</w:t>
       </w:r>
       <w:r>
-        <w:t>, aunque después escriba la contraseña correcta. Es una protección contra quien intente adivinarla probando una y otra vez. Si le ocurre, espere ese tiempo o restablezca la contraseña como se explica en el apartado siguiente.</w:t>
+        <w:t>, aunque después escribas la contraseña correcta. Es una protección contra quien intente adivinarla probando una y otra vez. Si te ocurre, espera ese tiempo o restablece la contraseña como se explica en el apartado siguiente.</w:t>
       </w:r>
     </w:p>
     <w:p>
@@ -2387,7 +2387,7 @@
         <w:jc w:val="both"/>
       </w:pPr>
       <w:r>
-        <w:t>Si olvidó su contraseña, no hace falta que nadie se la cambie: usted mismo puede definir una nueva.</w:t>
+        <w:t>Si olvidaste tu contraseña, no hace falta que nadie te la cambie: tú mismo puedes definir una nueva.</w:t>
       </w:r>
     </w:p>
     <w:p>
@@ -2400,10 +2400,10 @@
           <w:noProof/>
         </w:rPr>
         <w:drawing>
-          <wp:inline distT="0" distB="0" distL="0" distR="0" wp14:anchorId="3769A906" wp14:editId="6B861CA9">
+          <wp:inline distT="0" distB="0" distL="0" distR="0" wp14:anchorId="5FD377F1" wp14:editId="4EAD3948">
             <wp:extent cx="3619500" cy="2438400"/>
             <wp:effectExtent l="0" t="0" r="0" b="0"/>
-            <wp:docPr id="273520973" name="Imagen 273520973"/>
+            <wp:docPr id="1955431047" name="Imagen 1955431047"/>
             <wp:cNvGraphicFramePr>
               <a:graphicFrameLocks xmlns:a="http://schemas.openxmlformats.org/drawingml/2006/main" noChangeAspect="1"/>
             </wp:cNvGraphicFramePr>
@@ -2465,7 +2465,7 @@
         <w:spacing w:after="60" w:line="258" w:lineRule="auto"/>
       </w:pPr>
       <w:r>
-        <w:t xml:space="preserve">En la pantalla de inicio de sesión, pulse </w:t>
+        <w:t xml:space="preserve">En la pantalla de inicio de sesión, pulsa </w:t>
       </w:r>
       <w:r>
         <w:rPr>
@@ -2488,7 +2488,7 @@
         <w:spacing w:after="60" w:line="258" w:lineRule="auto"/>
       </w:pPr>
       <w:r>
-        <w:t xml:space="preserve">Escriba su correo y pulse </w:t>
+        <w:t xml:space="preserve">Escribe tu correo y pulsa </w:t>
       </w:r>
       <w:r>
         <w:rPr>
@@ -2511,7 +2511,7 @@
         <w:spacing w:after="60" w:line="258" w:lineRule="auto"/>
       </w:pPr>
       <w:r>
-        <w:t>Abra su correo y pulse el enlace que recibió. Si no aparece, revise la carpeta de correo no deseado.</w:t>
+        <w:t>Abre tu correo y pulsa el enlace que recibiste. Si no aparece, revisa la carpeta de correo no deseado.</w:t>
       </w:r>
     </w:p>
     <w:p>
@@ -2524,10 +2524,10 @@
           <w:noProof/>
         </w:rPr>
         <w:drawing>
-          <wp:inline distT="0" distB="0" distL="0" distR="0" wp14:anchorId="130680E0" wp14:editId="7B8AC00D">
+          <wp:inline distT="0" distB="0" distL="0" distR="0" wp14:anchorId="667B6C1A" wp14:editId="27EEFF55">
             <wp:extent cx="3619500" cy="2819400"/>
             <wp:effectExtent l="0" t="0" r="0" b="0"/>
-            <wp:docPr id="501847866" name="Imagen 501847866"/>
+            <wp:docPr id="952754613" name="Imagen 952754613"/>
             <wp:cNvGraphicFramePr>
               <a:graphicFrameLocks xmlns:a="http://schemas.openxmlformats.org/drawingml/2006/main" noChangeAspect="1"/>
             </wp:cNvGraphicFramePr>
@@ -2589,7 +2589,7 @@
         <w:spacing w:after="60" w:line="258" w:lineRule="auto"/>
       </w:pPr>
       <w:r>
-        <w:t>Escriba la contraseña nueva dos veces, para evitar una errata en un campo que no se ve.</w:t>
+        <w:t>Escribe la contraseña nueva dos veces, para evitar una errata en un campo que no se ve.</w:t>
       </w:r>
     </w:p>
     <w:p>
@@ -2602,7 +2602,7 @@
         <w:spacing w:after="60" w:line="258" w:lineRule="auto"/>
       </w:pPr>
       <w:r>
-        <w:t xml:space="preserve">Pulse </w:t>
+        <w:t xml:space="preserve">Pulsa </w:t>
       </w:r>
       <w:r>
         <w:rPr>
@@ -2612,7 +2612,7 @@
         <w:t>Guardar contraseña</w:t>
       </w:r>
       <w:r>
-        <w:t>. Volverá a la pantalla de inicio de sesión y ya podrá entrar con la nueva.</w:t>
+        <w:t>. Volverás a la pantalla de inicio de sesión y ya podrás entrar con la nueva.</w:t>
       </w:r>
     </w:p>
     <w:p>
@@ -2628,7 +2628,7 @@
         <w:t>El enlace vence a los treinta minutos y solo sirve una vez.</w:t>
       </w:r>
       <w:r>
-        <w:t xml:space="preserve"> Si se le pasó el tiempo, o si lo usó y quiere cambiarla otra vez, sencillamente solicite otro.</w:t>
+        <w:t xml:space="preserve"> Si se te pasó el tiempo, o si lo usaste y quieres cambiarla otra vez, sencillamente solicita otro.</w:t>
       </w:r>
     </w:p>
     <w:p>
@@ -2637,7 +2637,7 @@
         <w:jc w:val="both"/>
       </w:pPr>
       <w:r>
-        <w:t>En pantalla verá siempre el mismo mensaje, exista o no una cuenta con ese correo. Es la misma razón del apartado 4.2: evitar que alguien averigüe qué correos están registrados.</w:t>
+        <w:t>En pantalla verás siempre el mismo mensaje, exista o no una cuenta con ese correo. Es la misma razón del apartado 4.2: evitar que alguien averigüe qué correos están registrados.</w:t>
       </w:r>
     </w:p>
     <w:p>
@@ -2666,7 +2666,7 @@
         <w:jc w:val="both"/>
       </w:pPr>
       <w:r>
-        <w:t>Es la primera pantalla que ve al entrar. Resume el estado de su licorera y da acceso al resto del sistema.</w:t>
+        <w:t>Es la primera pantalla que ves al entrar. Resume el estado de tu licorera y da acceso al resto del sistema.</w:t>
       </w:r>
     </w:p>
     <w:p>
@@ -2679,10 +2679,10 @@
           <w:noProof/>
         </w:rPr>
         <w:drawing>
-          <wp:inline distT="0" distB="0" distL="0" distR="0" wp14:anchorId="14F6B926" wp14:editId="5829952F">
+          <wp:inline distT="0" distB="0" distL="0" distR="0" wp14:anchorId="16C62A36" wp14:editId="4B4E1449">
             <wp:extent cx="4953000" cy="2476500"/>
             <wp:effectExtent l="0" t="0" r="0" b="0"/>
-            <wp:docPr id="283447266" name="Imagen 283447266"/>
+            <wp:docPr id="1019277899" name="Imagen 1019277899"/>
             <wp:cNvGraphicFramePr>
               <a:graphicFrameLocks xmlns:a="http://schemas.openxmlformats.org/drawingml/2006/main" noChangeAspect="1"/>
             </wp:cNvGraphicFramePr>
@@ -2740,7 +2740,7 @@
         <w:jc w:val="both"/>
       </w:pPr>
       <w:r>
-        <w:t>A la izquierda está el menú con los módulos. Arriba, el nombre de su licorera, sus iniciales y el botón para cerrar sesión, que está disponible desde cualquier pantalla.</w:t>
+        <w:t>A la izquierda está el menú con los módulos. Arriba, el nombre de tu licorera, tus iniciales y el botón para cerrar sesión, que está disponible desde cualquier pantalla.</w:t>
       </w:r>
     </w:p>
     <w:p>
@@ -2787,7 +2787,7 @@
           <w:szCs w:val="27"/>
         </w:rPr>
         <w:lastRenderedPageBreak/>
-        <w:t>7. Los usuarios de su licorera</w:t>
+        <w:t>7. Los usuarios de tu licorera</w:t>
       </w:r>
       <w:bookmarkEnd w:id="12"/>
     </w:p>
@@ -2797,7 +2797,7 @@
         <w:jc w:val="both"/>
       </w:pPr>
       <w:r>
-        <w:t>Este apartado es solo para administradores. Aquí decide quién puede entrar al sistema de su negocio.</w:t>
+        <w:t>Este apartado es solo para administradores. Aquí decides quién puede entrar al sistema de tu negocio.</w:t>
       </w:r>
     </w:p>
     <w:p>
@@ -2824,7 +2824,7 @@
         <w:jc w:val="both"/>
       </w:pPr>
       <w:r>
-        <w:t xml:space="preserve">Pulse </w:t>
+        <w:t xml:space="preserve">Pulsa </w:t>
       </w:r>
       <w:r>
         <w:rPr>
@@ -2834,7 +2834,7 @@
         <w:t>Usuarios</w:t>
       </w:r>
       <w:r>
-        <w:t xml:space="preserve"> en el menú de la izquierda. Verá la lista de todas las cuentas de su licorera, con su rol y su estado. Su propia fila aparece señalada con la etiqueta «Tú».</w:t>
+        <w:t xml:space="preserve"> en el menú de la izquierda. Verás la lista de todas las cuentas de tu licorera, con su rol y su estado. Tu propia fila aparece señalada con la etiqueta «Tú».</w:t>
       </w:r>
     </w:p>
     <w:p>
@@ -2847,10 +2847,10 @@
           <w:noProof/>
         </w:rPr>
         <w:drawing>
-          <wp:inline distT="0" distB="0" distL="0" distR="0" wp14:anchorId="4E4D169F" wp14:editId="7E69B6D6">
+          <wp:inline distT="0" distB="0" distL="0" distR="0" wp14:anchorId="0D6D16FB" wp14:editId="2D174239">
             <wp:extent cx="4953000" cy="2447925"/>
             <wp:effectExtent l="0" t="0" r="0" b="0"/>
-            <wp:docPr id="1365188657" name="Imagen 1365188657"/>
+            <wp:docPr id="1964794451" name="Imagen 1964794451"/>
             <wp:cNvGraphicFramePr>
               <a:graphicFrameLocks xmlns:a="http://schemas.openxmlformats.org/drawingml/2006/main" noChangeAspect="1"/>
             </wp:cNvGraphicFramePr>
@@ -2908,7 +2908,7 @@
         <w:jc w:val="both"/>
       </w:pPr>
       <w:r>
-        <w:t>Solo aparecen las cuentas de su negocio. Las de otras licoreras no existen para usted, ni siquiera escribiendo la dirección a mano.</w:t>
+        <w:t>Solo aparecen las cuentas de tu negocio. Las de otras licoreras no existen para ti, ni siquiera escribiendo la dirección a mano.</w:t>
       </w:r>
     </w:p>
     <w:p>
@@ -2939,10 +2939,10 @@
           <w:noProof/>
         </w:rPr>
         <w:drawing>
-          <wp:inline distT="0" distB="0" distL="0" distR="0" wp14:anchorId="38983138" wp14:editId="41A50663">
+          <wp:inline distT="0" distB="0" distL="0" distR="0" wp14:anchorId="70545088" wp14:editId="6DA26AB6">
             <wp:extent cx="6286500" cy="3124200"/>
             <wp:effectExtent l="0" t="0" r="0" b="0"/>
-            <wp:docPr id="903195174" name="Imagen 903195174"/>
+            <wp:docPr id="388069599" name="Imagen 388069599"/>
             <wp:cNvGraphicFramePr>
               <a:graphicFrameLocks xmlns:a="http://schemas.openxmlformats.org/drawingml/2006/main" noChangeAspect="1"/>
             </wp:cNvGraphicFramePr>
@@ -3004,7 +3004,7 @@
         <w:spacing w:after="60" w:line="258" w:lineRule="auto"/>
       </w:pPr>
       <w:r>
-        <w:t xml:space="preserve">Pulse </w:t>
+        <w:t xml:space="preserve">Pulsa </w:t>
       </w:r>
       <w:r>
         <w:rPr>
@@ -3027,7 +3027,7 @@
         <w:spacing w:after="60" w:line="258" w:lineRule="auto"/>
       </w:pPr>
       <w:r>
-        <w:t>Escriba el nombre, el correo y, si quiere, el teléfono de la persona.</w:t>
+        <w:t>Escribe el nombre, el correo y, si quieres, el teléfono de la persona.</w:t>
       </w:r>
     </w:p>
     <w:p>
@@ -3040,7 +3040,7 @@
         <w:spacing w:after="60" w:line="258" w:lineRule="auto"/>
       </w:pPr>
       <w:r>
-        <w:t>Elija el rol: Administrador o Vendedor.</w:t>
+        <w:t>Elige el rol: Administrador o Vendedor.</w:t>
       </w:r>
     </w:p>
     <w:p>
@@ -3054,7 +3054,7 @@
       </w:pPr>
       <w:r>
         <w:lastRenderedPageBreak/>
-        <w:t>Defina una contraseña inicial y entréguesela a la persona. Ella podrá cambiarla después desde su perfil.</w:t>
+        <w:t>Define una contraseña inicial y entrégasela a la persona. Ella podrá cambiarla después desde su perfil.</w:t>
       </w:r>
     </w:p>
     <w:p>
@@ -3067,7 +3067,7 @@
         <w:spacing w:after="60" w:line="258" w:lineRule="auto"/>
       </w:pPr>
       <w:r>
-        <w:t xml:space="preserve">Pulse </w:t>
+        <w:t xml:space="preserve">Pulsa </w:t>
       </w:r>
       <w:r>
         <w:rPr>
@@ -3093,7 +3093,7 @@
         <w:t xml:space="preserve">Si aparece un aviso sobre el plan, </w:t>
       </w:r>
       <w:r>
-        <w:t>es porque el plan contratado no admite más cuentas. El plan Básico permite un solo usuario; para agregar más hay que cambiar de plan. El aviso indica cuál es su plan y cuántas cuentas permite.</w:t>
+        <w:t>es porque el plan contratado no admite más cuentas. El plan Básico permite un solo usuario; para agregar más hay que cambiar de plan. El aviso indica cuál es tu plan y cuántas cuentas permite.</w:t>
       </w:r>
     </w:p>
     <w:p>
@@ -3120,7 +3120,7 @@
         <w:jc w:val="both"/>
       </w:pPr>
       <w:r>
-        <w:t xml:space="preserve">Pulse </w:t>
+        <w:t xml:space="preserve">Pulsa </w:t>
       </w:r>
       <w:r>
         <w:rPr>
@@ -3130,7 +3130,7 @@
         <w:t>Editar</w:t>
       </w:r>
       <w:r>
-        <w:t xml:space="preserve"> en la fila de la persona. Puede corregir su nombre, su teléfono, su correo y su rol. La contraseña no se edita desde aquí: cada quien cambia la suya desde su perfil, o la restablece por correo. Usted, como administrador, no conoce ni define las contraseñas ajenas.</w:t>
+        <w:t xml:space="preserve"> en la fila de la persona. Puedes corregir su nombre, su teléfono, su correo y su rol. La contraseña no se edita desde aquí: tú defines una al crear la cuenta, y a partir de ese momento cada quien cambia la suya desde su perfil o la restablece por correo. Si alguien la olvida, no se la reasignes: pídele que use «¿Olvidaste tu contraseña?» en la pantalla de ingreso.</w:t>
       </w:r>
     </w:p>
     <w:p>
@@ -3157,7 +3157,7 @@
         <w:jc w:val="both"/>
       </w:pPr>
       <w:r>
-        <w:t>Cuando un empleado deja el negocio, su cuenta no se borra: se marca como inactiva. Así deja de poder entrar, pero sus ventas y sus movimientos siguen registrados a su nombre, que es lo que necesita para cuadrar cuentas y para cualquier revisión posterior.</w:t>
+        <w:t>Cuando un empleado deja el negocio, su cuenta no se borra: se marca como inactiva. Así deja de poder entrar, pero sus ventas y sus movimientos siguen registrados a su nombre, que es lo que necesitas para cuadrar cuentas y para cualquier revisión posterior.</w:t>
       </w:r>
     </w:p>
     <w:p>
@@ -3170,10 +3170,10 @@
           <w:noProof/>
         </w:rPr>
         <w:drawing>
-          <wp:inline distT="0" distB="0" distL="0" distR="0" wp14:anchorId="72F2E405" wp14:editId="6B228EC5">
+          <wp:inline distT="0" distB="0" distL="0" distR="0" wp14:anchorId="0AE4CB52" wp14:editId="0658BE5E">
             <wp:extent cx="4953000" cy="2438400"/>
             <wp:effectExtent l="0" t="0" r="0" b="0"/>
-            <wp:docPr id="293235049" name="Imagen 293235049"/>
+            <wp:docPr id="1556276378" name="Imagen 1556276378"/>
             <wp:cNvGraphicFramePr>
               <a:graphicFrameLocks xmlns:a="http://schemas.openxmlformats.org/drawingml/2006/main" noChangeAspect="1"/>
             </wp:cNvGraphicFramePr>
@@ -3235,7 +3235,7 @@
         <w:spacing w:after="60" w:line="258" w:lineRule="auto"/>
       </w:pPr>
       <w:r>
-        <w:t xml:space="preserve">Pulse </w:t>
+        <w:t xml:space="preserve">Pulsa </w:t>
       </w:r>
       <w:r>
         <w:rPr>
@@ -3258,7 +3258,7 @@
         <w:spacing w:after="60" w:line="258" w:lineRule="auto"/>
       </w:pPr>
       <w:r>
-        <w:t xml:space="preserve">Lea el aviso y pulse </w:t>
+        <w:t xml:space="preserve">Lee el aviso y pulsa </w:t>
       </w:r>
       <w:r>
         <w:rPr>
@@ -3278,7 +3278,7 @@
         <w:t>Cancelar</w:t>
       </w:r>
       <w:r>
-        <w:t xml:space="preserve"> si se equivocó.</w:t>
+        <w:t xml:space="preserve"> si te equivocaste.</w:t>
       </w:r>
     </w:p>
     <w:p>
@@ -3287,7 +3287,7 @@
         <w:jc w:val="both"/>
       </w:pPr>
       <w:r>
-        <w:t>Su propia cuenta no tiene ese botón: nadie puede retirarse el acceso a sí mismo y dejar la licorera sin administrador.</w:t>
+        <w:t>Tu propia cuenta no tiene ese botón: nadie puede retirarse el acceso a sí mismo y dejar la licorera sin administrador.</w:t>
       </w:r>
     </w:p>
     <w:p>
@@ -3314,7 +3314,7 @@
         <w:jc w:val="both"/>
       </w:pPr>
       <w:r>
-        <w:t xml:space="preserve">Las cuentas inactivas siguen en la lista, marcadas en rojo. Para que la persona pueda volver a entrar, pulse </w:t>
+        <w:t xml:space="preserve">Las cuentas inactivas siguen en la lista, marcadas en rojo. Para que la persona pueda volver a entrar, pulsa </w:t>
       </w:r>
       <w:r>
         <w:rPr>
@@ -3343,7 +3343,7 @@
           <w:szCs w:val="27"/>
         </w:rPr>
         <w:lastRenderedPageBreak/>
-        <w:t>8. Su perfil</w:t>
+        <w:t>8. Tu perfil</w:t>
       </w:r>
       <w:bookmarkEnd w:id="18"/>
     </w:p>
@@ -3353,7 +3353,7 @@
         <w:jc w:val="both"/>
       </w:pPr>
       <w:r>
-        <w:t xml:space="preserve">Pulse </w:t>
+        <w:t xml:space="preserve">Pulsa </w:t>
       </w:r>
       <w:r>
         <w:rPr>
@@ -3363,7 +3363,7 @@
         <w:t>Mi perfil</w:t>
       </w:r>
       <w:r>
-        <w:t xml:space="preserve"> en el menú, abajo. Desde ahí puede cambiar sus datos y su contraseña. Esta pantalla está disponible para todos, administradores y vendedores.</w:t>
+        <w:t xml:space="preserve"> en el menú, abajo. Desde ahí puedes cambiar tus datos y tu contraseña. Esta pantalla está disponible para todos, administradores y vendedores.</w:t>
       </w:r>
     </w:p>
     <w:p>
@@ -3376,10 +3376,10 @@
           <w:noProof/>
         </w:rPr>
         <w:drawing>
-          <wp:inline distT="0" distB="0" distL="0" distR="0" wp14:anchorId="27CC1E9E" wp14:editId="5CBF6166">
+          <wp:inline distT="0" distB="0" distL="0" distR="0" wp14:anchorId="158BCAC2" wp14:editId="2EEE2734">
             <wp:extent cx="6286500" cy="3162300"/>
             <wp:effectExtent l="0" t="0" r="0" b="0"/>
-            <wp:docPr id="680303824" name="Imagen 680303824"/>
+            <wp:docPr id="153023464" name="Imagen 153023464"/>
             <wp:cNvGraphicFramePr>
               <a:graphicFrameLocks xmlns:a="http://schemas.openxmlformats.org/drawingml/2006/main" noChangeAspect="1"/>
             </wp:cNvGraphicFramePr>
@@ -3445,7 +3445,7 @@
           <w:sz w:val="23"/>
           <w:szCs w:val="23"/>
         </w:rPr>
-        <w:t>8.1 Cambiar su nombre o su teléfono</w:t>
+        <w:t>8.1 Cambiar tu nombre o tu teléfono</w:t>
       </w:r>
       <w:bookmarkEnd w:id="19"/>
     </w:p>
@@ -3455,7 +3455,7 @@
         <w:jc w:val="both"/>
       </w:pPr>
       <w:r>
-        <w:t xml:space="preserve">Corrija el dato y pulse </w:t>
+        <w:t xml:space="preserve">Corrige el dato y pulsa </w:t>
       </w:r>
       <w:r>
         <w:rPr>
@@ -3465,7 +3465,7 @@
         <w:t>Guardar cambios</w:t>
       </w:r>
       <w:r>
-        <w:t>. El botón permanece apagado mientras no cambie nada, para que no se guarde por error. El nombre nuevo aparece de inmediato en el saludo del panel.</w:t>
+        <w:t>. El botón permanece apagado mientras no cambies nada, para que no se guarde por error. El nombre nuevo aparece de inmediato en el saludo del panel.</w:t>
       </w:r>
     </w:p>
     <w:p>
@@ -3482,7 +3482,7 @@
           <w:sz w:val="23"/>
           <w:szCs w:val="23"/>
         </w:rPr>
-        <w:t>8.2 Cambiar su contraseña</w:t>
+        <w:t>8.2 Cambiar tu contraseña</w:t>
       </w:r>
       <w:bookmarkEnd w:id="20"/>
     </w:p>
@@ -3492,7 +3492,7 @@
         <w:jc w:val="both"/>
       </w:pPr>
       <w:r>
-        <w:t>Escriba su contraseña actual, la nueva dos veces, y pulse «Cambiar contraseña». Al terminar, la sesión se cierra y tendrá que entrar de nuevo con la contraseña nueva.</w:t>
+        <w:t>Escribe tu contraseña actual, la nueva dos veces, y pulsa «Cambiar contraseña». Al terminar, la sesión se cierra y tendrás que entrar de nuevo con la contraseña nueva.</w:t>
       </w:r>
     </w:p>
     <w:p>
@@ -3505,10 +3505,10 @@
           <w:b/>
           <w:bCs/>
         </w:rPr>
-        <w:t xml:space="preserve">¿Por qué pide la contraseña actual si ya entró? </w:t>
-      </w:r>
-      <w:r>
-        <w:t>Por si deja el equipo desatendido. Si alguien se sienta en su computador con la sesión abierta, sin ese dato no puede quedarse con la cuenta. Que el sistema sepa quién es usted no es lo mismo que comprobar que es usted quien está escribiendo.</w:t>
+        <w:t xml:space="preserve">¿Por qué pide la contraseña actual si ya entraste? </w:t>
+      </w:r>
+      <w:r>
+        <w:t>Por si dejas el equipo desatendido. Si alguien se sienta en tu computador con la sesión abierta, sin ese dato no puede quedarse con la cuenta. Que el sistema sepa quién eres no es lo mismo que comprobar que eres tú quien está escribiendo.</w:t>
       </w:r>
     </w:p>
     <w:p>
@@ -3525,7 +3525,7 @@
           <w:sz w:val="23"/>
           <w:szCs w:val="23"/>
         </w:rPr>
-        <w:t>8.3 Lo que no puede cambiar usted</w:t>
+        <w:t>8.3 Lo que no puedes cambiar tú</w:t>
       </w:r>
       <w:bookmarkEnd w:id="21"/>
     </w:p>
@@ -3540,10 +3540,10 @@
         </w:rPr>
         <w:lastRenderedPageBreak/>
         <w:drawing>
-          <wp:inline distT="0" distB="0" distL="0" distR="0" wp14:anchorId="35086344" wp14:editId="1DD5000C">
+          <wp:inline distT="0" distB="0" distL="0" distR="0" wp14:anchorId="0162CE9C" wp14:editId="469CEC8C">
             <wp:extent cx="6286500" cy="3124200"/>
             <wp:effectExtent l="0" t="0" r="0" b="0"/>
-            <wp:docPr id="852375776" name="Imagen 852375776"/>
+            <wp:docPr id="12070485" name="Imagen 12070485"/>
             <wp:cNvGraphicFramePr>
               <a:graphicFrameLocks xmlns:a="http://schemas.openxmlformats.org/drawingml/2006/main" noChangeAspect="1"/>
             </wp:cNvGraphicFramePr>
@@ -3601,7 +3601,7 @@
         <w:jc w:val="both"/>
       </w:pPr>
       <w:r>
-        <w:t>El correo, el rol y la licorera aparecen para consultarlos, pero no se editan desde el perfil. El correo es su identificador de acceso y el rol define lo que puede hacer; los cambia el administrador de la licorera desde la pantalla de usuarios.</w:t>
+        <w:t>El correo, el rol y la licorera aparecen para consultarlos, pero no se editan desde el perfil. El correo es tu identificador de acceso y el rol define lo que puedes hacer; los cambia el administrador de la licorera desde la pantalla de usuarios.</w:t>
       </w:r>
     </w:p>
     <w:p>
@@ -3630,7 +3630,7 @@
         <w:jc w:val="both"/>
       </w:pPr>
       <w:r>
-        <w:t>Estos son los avisos que puede encontrarse y qué hacer en cada caso.</w:t>
+        <w:t>Estos son los avisos que puedes encontrarte y qué hacer en cada caso.</w:t>
       </w:r>
     </w:p>
     <w:tbl>
@@ -3649,7 +3649,7 @@
           <w:left w:w="10" w:type="dxa"/>
           <w:right w:w="10" w:type="dxa"/>
         </w:tblCellMar>
-        <w:tblLook w:val="0000" w:firstRow="0" w:lastRow="0" w:firstColumn="0" w:lastColumn="0" w:noHBand="0" w:noVBand="0"/>
+        <w:tblLook w:val="04A0" w:firstRow="1" w:lastRow="0" w:firstColumn="1" w:lastColumn="0" w:noHBand="0" w:noVBand="1"/>
       </w:tblPr>
       <w:tblGrid>
         <w:gridCol w:w="2900"/>
@@ -3823,7 +3823,7 @@
                 <w:sz w:val="19"/>
                 <w:szCs w:val="19"/>
               </w:rPr>
-              <w:t>Revise el correo y vuelva a intentar. Si no la recuerda, use «¿Olvidaste tu contraseña?».</w:t>
+              <w:t>Revisa el correo y vuelve a intentar. Si no la recuerdas, usa «¿Olvidaste tu contraseña?».</w:t>
             </w:r>
           </w:p>
         </w:tc>
@@ -3903,7 +3903,7 @@
                 <w:sz w:val="19"/>
                 <w:szCs w:val="19"/>
               </w:rPr>
-              <w:t>Espere quince minutos, o restablezca la contraseña por correo.</w:t>
+              <w:t>Espera quince minutos, o restablece la contraseña por correo.</w:t>
             </w:r>
           </w:p>
         </w:tc>
@@ -3983,7 +3983,7 @@
                 <w:sz w:val="19"/>
                 <w:szCs w:val="19"/>
               </w:rPr>
-              <w:t>Pídale que la reactive (apartado 7.5).</w:t>
+              <w:t>Pídele que la reactive (apartado 7.5).</w:t>
             </w:r>
           </w:p>
         </w:tc>
@@ -4063,7 +4063,7 @@
                 <w:sz w:val="19"/>
                 <w:szCs w:val="19"/>
               </w:rPr>
-              <w:t>Use otro correo, o recupere la contraseña de la cuenta existente.</w:t>
+              <w:t>Usa otro correo, o recupera la contraseña de la cuenta existente.</w:t>
             </w:r>
           </w:p>
         </w:tc>
@@ -4143,7 +4143,7 @@
                 <w:sz w:val="19"/>
                 <w:szCs w:val="19"/>
               </w:rPr>
-              <w:t>Vuelva a pedir el enlace desde «¿Olvidaste tu contraseña?».</w:t>
+              <w:t>Vuelve a pedir el enlace desde «¿Olvidaste tu contraseña?».</w:t>
             </w:r>
           </w:p>
         </w:tc>
@@ -4175,7 +4175,7 @@
                 <w:sz w:val="19"/>
                 <w:szCs w:val="19"/>
               </w:rPr>
-              <w:t>El plan Básico permite 1 usuario(s). Para agregar más, cambia de plan.</w:t>
+              <w:t>El plan Básico permite un usuario. Para agregar más, cambia de plan.</w:t>
             </w:r>
           </w:p>
         </w:tc>
@@ -4223,7 +4223,7 @@
                 <w:sz w:val="19"/>
                 <w:szCs w:val="19"/>
               </w:rPr>
-              <w:t>Cambie de plan, o inactive una cuenta que ya no se use.</w:t>
+              <w:t>Cambia de plan, o inactiva una cuenta que ya no se use.</w:t>
             </w:r>
           </w:p>
         </w:tc>
@@ -4303,7 +4303,7 @@
                 <w:sz w:val="19"/>
                 <w:szCs w:val="19"/>
               </w:rPr>
-              <w:t>Vuelva a escribirlo. Si no la recuerda, cierre sesión y use la recuperación por correo.</w:t>
+              <w:t>Vuelve a escribirlo. Si no la recuerdas, cierra sesión y usa la recuperación por correo.</w:t>
             </w:r>
           </w:p>
         </w:tc>
@@ -4383,7 +4383,7 @@
                 <w:sz w:val="19"/>
                 <w:szCs w:val="19"/>
               </w:rPr>
-              <w:t>Pídale a otro administrador que lo haga, si de verdad hace falta.</w:t>
+              <w:t>Pídele a otro administrador que lo haga, si de verdad hace falta.</w:t>
             </w:r>
           </w:p>
         </w:tc>
@@ -4439,7 +4439,7 @@
                 <w:sz w:val="19"/>
                 <w:szCs w:val="19"/>
               </w:rPr>
-              <w:t>La cuenta con la que entró es de vendedor.</w:t>
+              <w:t>La cuenta con la que entraste es de vendedor.</w:t>
             </w:r>
           </w:p>
         </w:tc>
@@ -4463,7 +4463,7 @@
                 <w:sz w:val="19"/>
                 <w:szCs w:val="19"/>
               </w:rPr>
-              <w:t>Solicítelo al administrador del negocio.</w:t>
+              <w:t>Solicítalo al administrador del negocio.</w:t>
             </w:r>
           </w:p>
         </w:tc>
@@ -4534,7 +4534,7 @@
         <w:t xml:space="preserve">Perdí el acceso al correo con el que me registré. </w:t>
       </w:r>
       <w:r>
-        <w:t>Pídale al administrador de su licorera que le cambie el correo desde la pantalla de usuarios. Si el que perdió el acceso es el administrador, hay que escribir al soporte de INVENTRA.</w:t>
+        <w:t>Pídele al administrador de tu licorera que te cambie el correo desde la pantalla de usuarios. Si el que perdió el acceso es el administrador, hay que escribir al soporte de INVENTRA.</w:t>
       </w:r>
     </w:p>
     <w:p>
@@ -4566,7 +4566,7 @@
         <w:t xml:space="preserve">¿Cada cuánto debo cambiar mi contraseña? </w:t>
       </w:r>
       <w:r>
-        <w:t>No es obligatorio hacerlo. Cámbiela si cree que alguien más la conoce, y no la reutilice de otros servicios.</w:t>
+        <w:t>No es obligatorio hacerlo. Cámbiala si crees que alguien más la conoce, y no la reutilices de otros servicios.</w:t>
       </w:r>
     </w:p>
     <w:sectPr>
@@ -4632,7 +4632,7 @@
         <w:sz w:val="18"/>
         <w:szCs w:val="18"/>
       </w:rPr>
-      <w:t>4</w:t>
+      <w:t>0</w:t>
     </w:r>
     <w:r>
       <w:rPr>
@@ -4667,10 +4667,96 @@
 <file path=word/numbering.xml><?xml version="1.0" encoding="utf-8"?>
 <w:numbering xmlns:wpc="http://schemas.microsoft.com/office/word/2010/wordprocessingCanvas" xmlns:cx="http://schemas.microsoft.com/office/drawing/2014/chartex" xmlns:cx1="http://schemas.microsoft.com/office/drawing/2015/9/8/chartex" xmlns:cx2="http://schemas.microsoft.com/office/drawing/2015/10/21/chartex" xmlns:cx3="http://schemas.microsoft.com/office/drawing/2016/5/9/chartex" xmlns:cx4="http://schemas.microsoft.com/office/drawing/2016/5/10/chartex" xmlns:cx5="http://schemas.microsoft.com/office/drawing/2016/5/11/chartex" xmlns:cx6="http://schemas.microsoft.com/office/drawing/2016/5/12/chartex" xmlns:cx7="http://schemas.microsoft.com/office/drawing/2016/5/13/chartex" xmlns:cx8="http://schemas.microsoft.com/office/drawing/2016/5/14/chartex" xmlns:mc="http://schemas.openxmlformats.org/markup-compatibility/2006" xmlns:aink="http://schemas.microsoft.com/office/drawing/2016/ink" xmlns:am3d="http://schemas.microsoft.com/office/drawing/2017/model3d" xmlns:o="urn:schemas-microsoft-com:office:office" xmlns:oel="http://schemas.microsoft.com/office/2019/extlst" xmlns:r="http://schemas.openxmlformats.org/officeDocument/2006/relationships" xmlns:m="http://schemas.openxmlformats.org/officeDocument/2006/math" xmlns:v="urn:schemas-microsoft-com:vml" xmlns:wp14="http://schemas.microsoft.com/office/word/2010/wordprocessingDrawing" xmlns:wp="http://schemas.openxmlformats.org/drawingml/2006/wordprocessingDrawing" xmlns:w10="urn:schemas-microsoft-com:office:word" xmlns:w="http://schemas.openxmlformats.org/wordprocessingml/2006/main" xmlns:w14="http://schemas.microsoft.com/office/word/2010/wordml" xmlns:w15="http://schemas.microsoft.com/office/word/2012/wordml" xmlns:w16cex="http://schemas.microsoft.com/office/word/2018/wordml/cex" xmlns:w16cid="http://schemas.microsoft.com/office/word/2016/wordml/cid" xmlns:w16="http://schemas.microsoft.com/office/word/2018/wordml" xmlns:w16du="http://schemas.microsoft.com/office/word/2023/wordml/word16du" xmlns:w16sdtdh="http://schemas.microsoft.com/office/word/2020/wordml/sdtdatahash" xmlns:w16sdtfl="http://schemas.microsoft.com/office/word/2024/wordml/sdtformatlock" xmlns:w16se="http://schemas.microsoft.com/office/word/2015/wordml/symex" xmlns:wpg="http://schemas.microsoft.com/office/word/2010/wordprocessingGroup" xmlns:wpi="http://schemas.microsoft.com/office/word/2010/wordprocessingInk" xmlns:wne="http://schemas.microsoft.com/office/word/2006/wordml" xmlns:wps="http://schemas.microsoft.com/office/word/2010/wordprocessingShape" mc:Ignorable="w14 w15 w16se w16cid w16 w16cex w16sdtdh w16sdtfl w16du wp14">
   <w:abstractNum w:abstractNumId="0" w15:restartNumberingAfterBreak="0">
-    <w:nsid w:val="569B43F3"/>
+    <w:nsid w:val="0CFB1CFC"/>
     <w:multiLevelType w:val="hybridMultilevel"/>
-    <w:tmpl w:val="10586E6A"/>
-    <w:lvl w:ilvl="0" w:tplc="66BE1D2C">
+    <w:tmpl w:val="4912C062"/>
+    <w:lvl w:ilvl="0" w:tplc="0F36E500">
+      <w:start w:val="1"/>
+      <w:numFmt w:val="bullet"/>
+      <w:lvlText w:val="●"/>
+      <w:lvlJc w:val="left"/>
+      <w:pPr>
+        <w:ind w:left="720" w:hanging="360"/>
+      </w:pPr>
+    </w:lvl>
+    <w:lvl w:ilvl="1" w:tplc="BBDC77D8">
+      <w:start w:val="1"/>
+      <w:numFmt w:val="bullet"/>
+      <w:lvlText w:val="○"/>
+      <w:lvlJc w:val="left"/>
+      <w:pPr>
+        <w:ind w:left="1440" w:hanging="360"/>
+      </w:pPr>
+    </w:lvl>
+    <w:lvl w:ilvl="2" w:tplc="127A4E66">
+      <w:start w:val="1"/>
+      <w:numFmt w:val="bullet"/>
+      <w:lvlText w:val="■"/>
+      <w:lvlJc w:val="left"/>
+      <w:pPr>
+        <w:ind w:left="2160" w:hanging="360"/>
+      </w:pPr>
+    </w:lvl>
+    <w:lvl w:ilvl="3" w:tplc="0DE8F44A">
+      <w:start w:val="1"/>
+      <w:numFmt w:val="bullet"/>
+      <w:lvlText w:val="●"/>
+      <w:lvlJc w:val="left"/>
+      <w:pPr>
+        <w:ind w:left="2880" w:hanging="360"/>
+      </w:pPr>
+    </w:lvl>
+    <w:lvl w:ilvl="4" w:tplc="5C36EA2A">
+      <w:start w:val="1"/>
+      <w:numFmt w:val="bullet"/>
+      <w:lvlText w:val="○"/>
+      <w:lvlJc w:val="left"/>
+      <w:pPr>
+        <w:ind w:left="3600" w:hanging="360"/>
+      </w:pPr>
+    </w:lvl>
+    <w:lvl w:ilvl="5" w:tplc="12443D9A">
+      <w:start w:val="1"/>
+      <w:numFmt w:val="bullet"/>
+      <w:lvlText w:val="■"/>
+      <w:lvlJc w:val="left"/>
+      <w:pPr>
+        <w:ind w:left="4320" w:hanging="360"/>
+      </w:pPr>
+    </w:lvl>
+    <w:lvl w:ilvl="6" w:tplc="C7C68702">
+      <w:start w:val="1"/>
+      <w:numFmt w:val="bullet"/>
+      <w:lvlText w:val="●"/>
+      <w:lvlJc w:val="left"/>
+      <w:pPr>
+        <w:ind w:left="5040" w:hanging="360"/>
+      </w:pPr>
+    </w:lvl>
+    <w:lvl w:ilvl="7" w:tplc="CAC6C6BA">
+      <w:start w:val="1"/>
+      <w:numFmt w:val="bullet"/>
+      <w:lvlText w:val="●"/>
+      <w:lvlJc w:val="left"/>
+      <w:pPr>
+        <w:ind w:left="5760" w:hanging="360"/>
+      </w:pPr>
+    </w:lvl>
+    <w:lvl w:ilvl="8" w:tplc="7B365C76">
+      <w:start w:val="1"/>
+      <w:numFmt w:val="bullet"/>
+      <w:lvlText w:val="●"/>
+      <w:lvlJc w:val="left"/>
+      <w:pPr>
+        <w:ind w:left="6480" w:hanging="360"/>
+      </w:pPr>
+    </w:lvl>
+  </w:abstractNum>
+  <w:abstractNum w:abstractNumId="1" w15:restartNumberingAfterBreak="0">
+    <w:nsid w:val="1FA94602"/>
+    <w:multiLevelType w:val="hybridMultilevel"/>
+    <w:tmpl w:val="DDF23CFC"/>
+    <w:lvl w:ilvl="0" w:tplc="F1B20040">
       <w:start w:val="1"/>
       <w:numFmt w:val="decimal"/>
       <w:lvlText w:val="%1."/>
@@ -4679,141 +4765,55 @@
         <w:ind w:left="420" w:hanging="260"/>
       </w:pPr>
     </w:lvl>
-    <w:lvl w:ilvl="1" w:tplc="86F4E01C">
+    <w:lvl w:ilvl="1" w:tplc="DCC4E7A8">
       <w:numFmt w:val="decimal"/>
       <w:lvlText w:val=""/>
       <w:lvlJc w:val="left"/>
     </w:lvl>
-    <w:lvl w:ilvl="2" w:tplc="0D420958">
+    <w:lvl w:ilvl="2" w:tplc="BB30A918">
       <w:numFmt w:val="decimal"/>
       <w:lvlText w:val=""/>
       <w:lvlJc w:val="left"/>
     </w:lvl>
-    <w:lvl w:ilvl="3" w:tplc="CFD0097C">
+    <w:lvl w:ilvl="3" w:tplc="740ED8DA">
       <w:numFmt w:val="decimal"/>
       <w:lvlText w:val=""/>
       <w:lvlJc w:val="left"/>
     </w:lvl>
-    <w:lvl w:ilvl="4" w:tplc="49FCB878">
+    <w:lvl w:ilvl="4" w:tplc="D188D39A">
       <w:numFmt w:val="decimal"/>
       <w:lvlText w:val=""/>
       <w:lvlJc w:val="left"/>
     </w:lvl>
-    <w:lvl w:ilvl="5" w:tplc="87CC07BE">
+    <w:lvl w:ilvl="5" w:tplc="356AADDC">
       <w:numFmt w:val="decimal"/>
       <w:lvlText w:val=""/>
       <w:lvlJc w:val="left"/>
     </w:lvl>
-    <w:lvl w:ilvl="6" w:tplc="74DCC12E">
+    <w:lvl w:ilvl="6" w:tplc="5FD28FE2">
       <w:numFmt w:val="decimal"/>
       <w:lvlText w:val=""/>
       <w:lvlJc w:val="left"/>
     </w:lvl>
-    <w:lvl w:ilvl="7" w:tplc="A76434FE">
+    <w:lvl w:ilvl="7" w:tplc="63369B62">
       <w:numFmt w:val="decimal"/>
       <w:lvlText w:val=""/>
       <w:lvlJc w:val="left"/>
     </w:lvl>
-    <w:lvl w:ilvl="8" w:tplc="7EFC0CAC">
+    <w:lvl w:ilvl="8" w:tplc="6D945294">
       <w:numFmt w:val="decimal"/>
       <w:lvlText w:val=""/>
       <w:lvlJc w:val="left"/>
     </w:lvl>
   </w:abstractNum>
-  <w:abstractNum w:abstractNumId="1" w15:restartNumberingAfterBreak="0">
-    <w:nsid w:val="7DDD6847"/>
-    <w:multiLevelType w:val="hybridMultilevel"/>
-    <w:tmpl w:val="96EC77DA"/>
-    <w:lvl w:ilvl="0" w:tplc="549EC190">
-      <w:start w:val="1"/>
-      <w:numFmt w:val="bullet"/>
-      <w:lvlText w:val="●"/>
-      <w:lvlJc w:val="left"/>
-      <w:pPr>
-        <w:ind w:left="720" w:hanging="360"/>
-      </w:pPr>
-    </w:lvl>
-    <w:lvl w:ilvl="1" w:tplc="2B6E7256">
-      <w:start w:val="1"/>
-      <w:numFmt w:val="bullet"/>
-      <w:lvlText w:val="○"/>
-      <w:lvlJc w:val="left"/>
-      <w:pPr>
-        <w:ind w:left="1440" w:hanging="360"/>
-      </w:pPr>
-    </w:lvl>
-    <w:lvl w:ilvl="2" w:tplc="D7A8D0C2">
-      <w:start w:val="1"/>
-      <w:numFmt w:val="bullet"/>
-      <w:lvlText w:val="■"/>
-      <w:lvlJc w:val="left"/>
-      <w:pPr>
-        <w:ind w:left="2160" w:hanging="360"/>
-      </w:pPr>
-    </w:lvl>
-    <w:lvl w:ilvl="3" w:tplc="3D4843D8">
-      <w:start w:val="1"/>
-      <w:numFmt w:val="bullet"/>
-      <w:lvlText w:val="●"/>
-      <w:lvlJc w:val="left"/>
-      <w:pPr>
-        <w:ind w:left="2880" w:hanging="360"/>
-      </w:pPr>
-    </w:lvl>
-    <w:lvl w:ilvl="4" w:tplc="334EBEE8">
-      <w:start w:val="1"/>
-      <w:numFmt w:val="bullet"/>
-      <w:lvlText w:val="○"/>
-      <w:lvlJc w:val="left"/>
-      <w:pPr>
-        <w:ind w:left="3600" w:hanging="360"/>
-      </w:pPr>
-    </w:lvl>
-    <w:lvl w:ilvl="5" w:tplc="6EF06252">
-      <w:start w:val="1"/>
-      <w:numFmt w:val="bullet"/>
-      <w:lvlText w:val="■"/>
-      <w:lvlJc w:val="left"/>
-      <w:pPr>
-        <w:ind w:left="4320" w:hanging="360"/>
-      </w:pPr>
-    </w:lvl>
-    <w:lvl w:ilvl="6" w:tplc="70FA7F54">
-      <w:start w:val="1"/>
-      <w:numFmt w:val="bullet"/>
-      <w:lvlText w:val="●"/>
-      <w:lvlJc w:val="left"/>
-      <w:pPr>
-        <w:ind w:left="5040" w:hanging="360"/>
-      </w:pPr>
-    </w:lvl>
-    <w:lvl w:ilvl="7" w:tplc="5C7A2464">
-      <w:start w:val="1"/>
-      <w:numFmt w:val="bullet"/>
-      <w:lvlText w:val="●"/>
-      <w:lvlJc w:val="left"/>
-      <w:pPr>
-        <w:ind w:left="5760" w:hanging="360"/>
-      </w:pPr>
-    </w:lvl>
-    <w:lvl w:ilvl="8" w:tplc="5CAEF6AC">
-      <w:start w:val="1"/>
-      <w:numFmt w:val="bullet"/>
-      <w:lvlText w:val="●"/>
-      <w:lvlJc w:val="left"/>
-      <w:pPr>
-        <w:ind w:left="6480" w:hanging="360"/>
-      </w:pPr>
-    </w:lvl>
-  </w:abstractNum>
-  <w:num w:numId="1" w16cid:durableId="466973768">
-    <w:abstractNumId w:val="1"/>
+  <w:num w:numId="1" w16cid:durableId="326329151">
+    <w:abstractNumId w:val="0"/>
     <w:lvlOverride w:ilvl="0">
       <w:startOverride w:val="1"/>
     </w:lvlOverride>
   </w:num>
-  <w:num w:numId="2" w16cid:durableId="250047831">
-    <w:abstractNumId w:val="0"/>
+  <w:num w:numId="2" w16cid:durableId="1993485900">
+    <w:abstractNumId w:val="1"/>
     <w:lvlOverride w:ilvl="0">
       <w:startOverride w:val="1"/>
     </w:lvlOverride>

</xml_diff>

<commit_message>
Construyo los estados de la suscripcion y el permiso que los aplica
</commit_message>
<xml_diff>
--- a/docs/manuales/INVENTRA_Manual_de_Usuario.docx
+++ b/docs/manuales/INVENTRA_Manual_de_Usuario.docx
@@ -154,6 +154,12 @@
         <w:gridCol w:w="3260"/>
       </w:tblGrid>
       <w:tr>
+        <w:tblPrEx>
+          <w:tblCellMar>
+            <w:top w:w="0" w:type="dxa"/>
+            <w:bottom w:w="0" w:type="dxa"/>
+          </w:tblCellMar>
+        </w:tblPrEx>
         <w:trPr>
           <w:tblHeader/>
         </w:trPr>
@@ -267,6 +273,12 @@
         </w:tc>
       </w:tr>
       <w:tr>
+        <w:tblPrEx>
+          <w:tblCellMar>
+            <w:top w:w="0" w:type="dxa"/>
+            <w:bottom w:w="0" w:type="dxa"/>
+          </w:tblCellMar>
+        </w:tblPrEx>
         <w:tc>
           <w:tcPr>
             <w:tcW w:w="1500" w:type="dxa"/>
@@ -1592,10 +1604,7 @@
       </w:r>
       <w:r>
         <w:lastRenderedPageBreak/>
-        <w:t>resolver una duda puntual, el apartado 9 reúne todos los mensajes que el sistema puede mostrarte y qué significa cada uno</w:t>
-      </w:r>
-      <w:r>
-        <w:t>.</w:t>
+        <w:t>resolver una duda puntual, el apartado 9 reúne todos los mensajes que el sistema puede mostrarte y qué significa cada uno.</w:t>
       </w:r>
     </w:p>
     <w:p>
@@ -1681,10 +1690,7 @@
         <w:jc w:val="both"/>
       </w:pPr>
       <w:r>
-        <w:t>El correo es importante: es con lo que entras al sistema y es a donde llega el enlace si algún día olvidas la contraseña. Usa uno tuyo, al que entres con frecuencia</w:t>
-      </w:r>
-      <w:r>
-        <w:t>.</w:t>
+        <w:t>El correo es importante: es con lo que entras al sistema y es a donde llega el enlace si algún día olvidas la contraseña. Usa uno tuyo, al que entres con frecuencia.</w:t>
       </w:r>
     </w:p>
     <w:p>
@@ -1737,6 +1743,12 @@
         <w:gridCol w:w="6760"/>
       </w:tblGrid>
       <w:tr>
+        <w:tblPrEx>
+          <w:tblCellMar>
+            <w:top w:w="0" w:type="dxa"/>
+            <w:bottom w:w="0" w:type="dxa"/>
+          </w:tblCellMar>
+        </w:tblPrEx>
         <w:trPr>
           <w:tblHeader/>
         </w:trPr>
@@ -1796,6 +1808,12 @@
         </w:tc>
       </w:tr>
       <w:tr>
+        <w:tblPrEx>
+          <w:tblCellMar>
+            <w:top w:w="0" w:type="dxa"/>
+            <w:bottom w:w="0" w:type="dxa"/>
+          </w:tblCellMar>
+        </w:tblPrEx>
         <w:tc>
           <w:tcPr>
             <w:tcW w:w="2600" w:type="dxa"/>
@@ -1846,6 +1864,12 @@
         </w:tc>
       </w:tr>
       <w:tr>
+        <w:tblPrEx>
+          <w:tblCellMar>
+            <w:top w:w="0" w:type="dxa"/>
+            <w:bottom w:w="0" w:type="dxa"/>
+          </w:tblCellMar>
+        </w:tblPrEx>
         <w:tc>
           <w:tcPr>
             <w:tcW w:w="2600" w:type="dxa"/>
@@ -1944,7 +1968,7 @@
           <w:noProof/>
         </w:rPr>
         <w:drawing>
-          <wp:inline distT="0" distB="0" distL="0" distR="0" wp14:anchorId="7B3A5383" wp14:editId="07A2BBC2">
+          <wp:inline distT="0" distB="0" distL="0" distR="0" wp14:anchorId="4E2238E5" wp14:editId="11ED825C">
             <wp:extent cx="3619500" cy="2809875"/>
             <wp:effectExtent l="0" t="0" r="0" b="0"/>
             <wp:docPr id="1" name="Imagen 1"/>
@@ -2169,6 +2193,22 @@
           <w:b/>
           <w:bCs/>
         </w:rPr>
+        <w:t xml:space="preserve">Cuando tu plan está por vencer. </w:t>
+      </w:r>
+      <w:r>
+        <w:t>Tres días antes de la fecha de vencimiento, el panel principal te avisa. Si la fecha pasa sin que renueves, tu licorera sigue funcionando con normalidad cuatro días más, con un aviso de pago a la vista. Pasados esos cuatro días tu información se conserva y la podrás seguir consultando, pero el sistema dejará de admitir registros nuevos hasta que renueves.</w:t>
+      </w:r>
+    </w:p>
+    <w:p>
+      <w:pPr>
+        <w:spacing w:after="110" w:line="262" w:lineRule="auto"/>
+        <w:jc w:val="both"/>
+      </w:pPr>
+      <w:r>
+        <w:rPr>
+          <w:b/>
+          <w:bCs/>
+        </w:rPr>
         <w:t xml:space="preserve">Verifica tu correo. </w:t>
       </w:r>
       <w:r>
@@ -2215,10 +2255,10 @@
           <w:noProof/>
         </w:rPr>
         <w:drawing>
-          <wp:inline distT="0" distB="0" distL="0" distR="0" wp14:anchorId="0909BC00" wp14:editId="557DFA28">
+          <wp:inline distT="0" distB="0" distL="0" distR="0" wp14:anchorId="5FAEBCBE" wp14:editId="4D8B9D23">
             <wp:extent cx="3619500" cy="1828800"/>
             <wp:effectExtent l="0" t="0" r="0" b="0"/>
-            <wp:docPr id="1791637088" name="Imagen 1791637088"/>
+            <wp:docPr id="410837931" name="Imagen 410837931"/>
             <wp:cNvGraphicFramePr>
               <a:graphicFrameLocks xmlns:a="http://schemas.openxmlformats.org/drawingml/2006/main" noChangeAspect="1"/>
             </wp:cNvGraphicFramePr>
@@ -2431,10 +2471,10 @@
           <w:noProof/>
         </w:rPr>
         <w:drawing>
-          <wp:inline distT="0" distB="0" distL="0" distR="0" wp14:anchorId="5CF2A62C" wp14:editId="63DDD76D">
+          <wp:inline distT="0" distB="0" distL="0" distR="0" wp14:anchorId="001838F0" wp14:editId="3C4CEDE9">
             <wp:extent cx="3619500" cy="2438400"/>
             <wp:effectExtent l="0" t="0" r="0" b="0"/>
-            <wp:docPr id="1241097006" name="Imagen 1241097006"/>
+            <wp:docPr id="1300667923" name="Imagen 1300667923"/>
             <wp:cNvGraphicFramePr>
               <a:graphicFrameLocks xmlns:a="http://schemas.openxmlformats.org/drawingml/2006/main" noChangeAspect="1"/>
             </wp:cNvGraphicFramePr>
@@ -2555,10 +2595,10 @@
           <w:noProof/>
         </w:rPr>
         <w:drawing>
-          <wp:inline distT="0" distB="0" distL="0" distR="0" wp14:anchorId="509E4A96" wp14:editId="63A03C19">
+          <wp:inline distT="0" distB="0" distL="0" distR="0" wp14:anchorId="6E4FC940" wp14:editId="05E8A047">
             <wp:extent cx="3619500" cy="2819400"/>
             <wp:effectExtent l="0" t="0" r="0" b="0"/>
-            <wp:docPr id="116475532" name="Imagen 116475532"/>
+            <wp:docPr id="1131887128" name="Imagen 1131887128"/>
             <wp:cNvGraphicFramePr>
               <a:graphicFrameLocks xmlns:a="http://schemas.openxmlformats.org/drawingml/2006/main" noChangeAspect="1"/>
             </wp:cNvGraphicFramePr>
@@ -2710,10 +2750,10 @@
           <w:noProof/>
         </w:rPr>
         <w:drawing>
-          <wp:inline distT="0" distB="0" distL="0" distR="0" wp14:anchorId="152E8298" wp14:editId="3454D032">
+          <wp:inline distT="0" distB="0" distL="0" distR="0" wp14:anchorId="4859795E" wp14:editId="2B91E01E">
             <wp:extent cx="4953000" cy="2476500"/>
             <wp:effectExtent l="0" t="0" r="0" b="0"/>
-            <wp:docPr id="1415252174" name="Imagen 1415252174"/>
+            <wp:docPr id="1293211519" name="Imagen 1293211519"/>
             <wp:cNvGraphicFramePr>
               <a:graphicFrameLocks xmlns:a="http://schemas.openxmlformats.org/drawingml/2006/main" noChangeAspect="1"/>
             </wp:cNvGraphicFramePr>
@@ -2934,10 +2974,10 @@
           <w:noProof/>
         </w:rPr>
         <w:drawing>
-          <wp:inline distT="0" distB="0" distL="0" distR="0" wp14:anchorId="34C3D2E0" wp14:editId="577DA481">
+          <wp:inline distT="0" distB="0" distL="0" distR="0" wp14:anchorId="164FB7FE" wp14:editId="0B523DA1">
             <wp:extent cx="4953000" cy="2447925"/>
             <wp:effectExtent l="0" t="0" r="0" b="0"/>
-            <wp:docPr id="1809430698" name="Imagen 1809430698"/>
+            <wp:docPr id="43089609" name="Imagen 43089609"/>
             <wp:cNvGraphicFramePr>
               <a:graphicFrameLocks xmlns:a="http://schemas.openxmlformats.org/drawingml/2006/main" noChangeAspect="1"/>
             </wp:cNvGraphicFramePr>
@@ -3026,10 +3066,10 @@
           <w:noProof/>
         </w:rPr>
         <w:drawing>
-          <wp:inline distT="0" distB="0" distL="0" distR="0" wp14:anchorId="0A1CCD7F" wp14:editId="0E043271">
+          <wp:inline distT="0" distB="0" distL="0" distR="0" wp14:anchorId="6D12FF5C" wp14:editId="0CDB5D44">
             <wp:extent cx="6286500" cy="3124200"/>
             <wp:effectExtent l="0" t="0" r="0" b="0"/>
-            <wp:docPr id="87143583" name="Imagen 87143583"/>
+            <wp:docPr id="892947557" name="Imagen 892947557"/>
             <wp:cNvGraphicFramePr>
               <a:graphicFrameLocks xmlns:a="http://schemas.openxmlformats.org/drawingml/2006/main" noChangeAspect="1"/>
             </wp:cNvGraphicFramePr>
@@ -3257,10 +3297,10 @@
           <w:noProof/>
         </w:rPr>
         <w:drawing>
-          <wp:inline distT="0" distB="0" distL="0" distR="0" wp14:anchorId="520FE075" wp14:editId="4622C650">
+          <wp:inline distT="0" distB="0" distL="0" distR="0" wp14:anchorId="5695C275" wp14:editId="4A51EAA7">
             <wp:extent cx="4953000" cy="2438400"/>
             <wp:effectExtent l="0" t="0" r="0" b="0"/>
-            <wp:docPr id="1576487572" name="Imagen 1576487572"/>
+            <wp:docPr id="725360277" name="Imagen 725360277"/>
             <wp:cNvGraphicFramePr>
               <a:graphicFrameLocks xmlns:a="http://schemas.openxmlformats.org/drawingml/2006/main" noChangeAspect="1"/>
             </wp:cNvGraphicFramePr>
@@ -3463,10 +3503,10 @@
           <w:noProof/>
         </w:rPr>
         <w:drawing>
-          <wp:inline distT="0" distB="0" distL="0" distR="0" wp14:anchorId="3F1ED4C9" wp14:editId="1CD6082D">
+          <wp:inline distT="0" distB="0" distL="0" distR="0" wp14:anchorId="43A3F4F0" wp14:editId="03F88717">
             <wp:extent cx="6286500" cy="3162300"/>
             <wp:effectExtent l="0" t="0" r="0" b="0"/>
-            <wp:docPr id="1485899524" name="Imagen 1485899524"/>
+            <wp:docPr id="1949818482" name="Imagen 1949818482"/>
             <wp:cNvGraphicFramePr>
               <a:graphicFrameLocks xmlns:a="http://schemas.openxmlformats.org/drawingml/2006/main" noChangeAspect="1"/>
             </wp:cNvGraphicFramePr>
@@ -3627,10 +3667,10 @@
         </w:rPr>
         <w:lastRenderedPageBreak/>
         <w:drawing>
-          <wp:inline distT="0" distB="0" distL="0" distR="0" wp14:anchorId="5A046210" wp14:editId="7532F718">
+          <wp:inline distT="0" distB="0" distL="0" distR="0" wp14:anchorId="7063200B" wp14:editId="25D14A06">
             <wp:extent cx="6286500" cy="3124200"/>
             <wp:effectExtent l="0" t="0" r="0" b="0"/>
-            <wp:docPr id="992089665" name="Imagen 992089665"/>
+            <wp:docPr id="45847447" name="Imagen 45847447"/>
             <wp:cNvGraphicFramePr>
               <a:graphicFrameLocks xmlns:a="http://schemas.openxmlformats.org/drawingml/2006/main" noChangeAspect="1"/>
             </wp:cNvGraphicFramePr>
@@ -3744,6 +3784,12 @@
         <w:gridCol w:w="3260"/>
       </w:tblGrid>
       <w:tr>
+        <w:tblPrEx>
+          <w:tblCellMar>
+            <w:top w:w="0" w:type="dxa"/>
+            <w:bottom w:w="0" w:type="dxa"/>
+          </w:tblCellMar>
+        </w:tblPrEx>
         <w:trPr>
           <w:tblHeader/>
         </w:trPr>
@@ -3830,6 +3876,12 @@
         </w:tc>
       </w:tr>
       <w:tr>
+        <w:tblPrEx>
+          <w:tblCellMar>
+            <w:top w:w="0" w:type="dxa"/>
+            <w:bottom w:w="0" w:type="dxa"/>
+          </w:tblCellMar>
+        </w:tblPrEx>
         <w:tc>
           <w:tcPr>
             <w:tcW w:w="2900" w:type="dxa"/>
@@ -3904,6 +3956,12 @@
         </w:tc>
       </w:tr>
       <w:tr>
+        <w:tblPrEx>
+          <w:tblCellMar>
+            <w:top w:w="0" w:type="dxa"/>
+            <w:bottom w:w="0" w:type="dxa"/>
+          </w:tblCellMar>
+        </w:tblPrEx>
         <w:tc>
           <w:tcPr>
             <w:tcW w:w="2900" w:type="dxa"/>
@@ -3978,6 +4036,12 @@
         </w:tc>
       </w:tr>
       <w:tr>
+        <w:tblPrEx>
+          <w:tblCellMar>
+            <w:top w:w="0" w:type="dxa"/>
+            <w:bottom w:w="0" w:type="dxa"/>
+          </w:tblCellMar>
+        </w:tblPrEx>
         <w:tc>
           <w:tcPr>
             <w:tcW w:w="2900" w:type="dxa"/>
@@ -4052,6 +4116,12 @@
         </w:tc>
       </w:tr>
       <w:tr>
+        <w:tblPrEx>
+          <w:tblCellMar>
+            <w:top w:w="0" w:type="dxa"/>
+            <w:bottom w:w="0" w:type="dxa"/>
+          </w:tblCellMar>
+        </w:tblPrEx>
         <w:tc>
           <w:tcPr>
             <w:tcW w:w="2900" w:type="dxa"/>
@@ -4126,6 +4196,12 @@
         </w:tc>
       </w:tr>
       <w:tr>
+        <w:tblPrEx>
+          <w:tblCellMar>
+            <w:top w:w="0" w:type="dxa"/>
+            <w:bottom w:w="0" w:type="dxa"/>
+          </w:tblCellMar>
+        </w:tblPrEx>
         <w:tc>
           <w:tcPr>
             <w:tcW w:w="2900" w:type="dxa"/>
@@ -4200,6 +4276,12 @@
         </w:tc>
       </w:tr>
       <w:tr>
+        <w:tblPrEx>
+          <w:tblCellMar>
+            <w:top w:w="0" w:type="dxa"/>
+            <w:bottom w:w="0" w:type="dxa"/>
+          </w:tblCellMar>
+        </w:tblPrEx>
         <w:tc>
           <w:tcPr>
             <w:tcW w:w="2900" w:type="dxa"/>
@@ -4274,6 +4356,12 @@
         </w:tc>
       </w:tr>
       <w:tr>
+        <w:tblPrEx>
+          <w:tblCellMar>
+            <w:top w:w="0" w:type="dxa"/>
+            <w:bottom w:w="0" w:type="dxa"/>
+          </w:tblCellMar>
+        </w:tblPrEx>
         <w:tc>
           <w:tcPr>
             <w:tcW w:w="2900" w:type="dxa"/>
@@ -4348,6 +4436,12 @@
         </w:tc>
       </w:tr>
       <w:tr>
+        <w:tblPrEx>
+          <w:tblCellMar>
+            <w:top w:w="0" w:type="dxa"/>
+            <w:bottom w:w="0" w:type="dxa"/>
+          </w:tblCellMar>
+        </w:tblPrEx>
         <w:tc>
           <w:tcPr>
             <w:tcW w:w="2900" w:type="dxa"/>
@@ -4422,6 +4516,12 @@
         </w:tc>
       </w:tr>
       <w:tr>
+        <w:tblPrEx>
+          <w:tblCellMar>
+            <w:top w:w="0" w:type="dxa"/>
+            <w:bottom w:w="0" w:type="dxa"/>
+          </w:tblCellMar>
+        </w:tblPrEx>
         <w:tc>
           <w:tcPr>
             <w:tcW w:w="2900" w:type="dxa"/>
@@ -4561,7 +4661,10 @@
         <w:t xml:space="preserve">Perdí el acceso al correo con el que me registré. </w:t>
       </w:r>
       <w:r>
-        <w:t>Pídele al administrador de tu licorera que te cambie el correo desde la pantalla de usuarios. Si el que perdió el acceso es el administrador, hay que escribir al soporte de INVENTRA.</w:t>
+        <w:t>Pídele al administrador de tu licorera que te cambie el correo desde la pantalla de usuarios. Si el que perdió el acceso es el administrador, hay que escribir al soporte de INVENTRA</w:t>
+      </w:r>
+      <w:r>
+        <w:t>.</w:t>
       </w:r>
     </w:p>
     <w:p>
@@ -4694,10 +4797,10 @@
 <file path=word/numbering.xml><?xml version="1.0" encoding="utf-8"?>
 <w:numbering xmlns:wpc="http://schemas.microsoft.com/office/word/2010/wordprocessingCanvas" xmlns:cx="http://schemas.microsoft.com/office/drawing/2014/chartex" xmlns:cx1="http://schemas.microsoft.com/office/drawing/2015/9/8/chartex" xmlns:cx2="http://schemas.microsoft.com/office/drawing/2015/10/21/chartex" xmlns:cx3="http://schemas.microsoft.com/office/drawing/2016/5/9/chartex" xmlns:cx4="http://schemas.microsoft.com/office/drawing/2016/5/10/chartex" xmlns:cx5="http://schemas.microsoft.com/office/drawing/2016/5/11/chartex" xmlns:cx6="http://schemas.microsoft.com/office/drawing/2016/5/12/chartex" xmlns:cx7="http://schemas.microsoft.com/office/drawing/2016/5/13/chartex" xmlns:cx8="http://schemas.microsoft.com/office/drawing/2016/5/14/chartex" xmlns:mc="http://schemas.openxmlformats.org/markup-compatibility/2006" xmlns:aink="http://schemas.microsoft.com/office/drawing/2016/ink" xmlns:am3d="http://schemas.microsoft.com/office/drawing/2017/model3d" xmlns:o="urn:schemas-microsoft-com:office:office" xmlns:oel="http://schemas.microsoft.com/office/2019/extlst" xmlns:r="http://schemas.openxmlformats.org/officeDocument/2006/relationships" xmlns:m="http://schemas.openxmlformats.org/officeDocument/2006/math" xmlns:v="urn:schemas-microsoft-com:vml" xmlns:wp14="http://schemas.microsoft.com/office/word/2010/wordprocessingDrawing" xmlns:wp="http://schemas.openxmlformats.org/drawingml/2006/wordprocessingDrawing" xmlns:w10="urn:schemas-microsoft-com:office:word" xmlns:w="http://schemas.openxmlformats.org/wordprocessingml/2006/main" xmlns:w14="http://schemas.microsoft.com/office/word/2010/wordml" xmlns:w15="http://schemas.microsoft.com/office/word/2012/wordml" xmlns:w16cex="http://schemas.microsoft.com/office/word/2018/wordml/cex" xmlns:w16cid="http://schemas.microsoft.com/office/word/2016/wordml/cid" xmlns:w16="http://schemas.microsoft.com/office/word/2018/wordml" xmlns:w16du="http://schemas.microsoft.com/office/word/2023/wordml/word16du" xmlns:w16sdtdh="http://schemas.microsoft.com/office/word/2020/wordml/sdtdatahash" xmlns:w16sdtfl="http://schemas.microsoft.com/office/word/2024/wordml/sdtformatlock" xmlns:w16se="http://schemas.microsoft.com/office/word/2015/wordml/symex" xmlns:wpg="http://schemas.microsoft.com/office/word/2010/wordprocessingGroup" xmlns:wpi="http://schemas.microsoft.com/office/word/2010/wordprocessingInk" xmlns:wne="http://schemas.microsoft.com/office/word/2006/wordml" xmlns:wps="http://schemas.microsoft.com/office/word/2010/wordprocessingShape" mc:Ignorable="w14 w15 w16se w16cid w16 w16cex w16sdtdh w16sdtfl w16du wp14">
   <w:abstractNum w:abstractNumId="0" w15:restartNumberingAfterBreak="0">
-    <w:nsid w:val="2E49591F"/>
+    <w:nsid w:val="13294C58"/>
     <w:multiLevelType w:val="hybridMultilevel"/>
-    <w:tmpl w:val="23A000C0"/>
-    <w:lvl w:ilvl="0" w:tplc="051C48D6">
+    <w:tmpl w:val="99D28E80"/>
+    <w:lvl w:ilvl="0" w:tplc="32229D9E">
       <w:start w:val="1"/>
       <w:numFmt w:val="bullet"/>
       <w:lvlText w:val="●"/>
@@ -4706,7 +4809,7 @@
         <w:ind w:left="720" w:hanging="360"/>
       </w:pPr>
     </w:lvl>
-    <w:lvl w:ilvl="1" w:tplc="A62C99D4">
+    <w:lvl w:ilvl="1" w:tplc="580EA7BC">
       <w:start w:val="1"/>
       <w:numFmt w:val="bullet"/>
       <w:lvlText w:val="○"/>
@@ -4715,7 +4818,7 @@
         <w:ind w:left="1440" w:hanging="360"/>
       </w:pPr>
     </w:lvl>
-    <w:lvl w:ilvl="2" w:tplc="F10CDA42">
+    <w:lvl w:ilvl="2" w:tplc="79D425B4">
       <w:start w:val="1"/>
       <w:numFmt w:val="bullet"/>
       <w:lvlText w:val="■"/>
@@ -4724,7 +4827,7 @@
         <w:ind w:left="2160" w:hanging="360"/>
       </w:pPr>
     </w:lvl>
-    <w:lvl w:ilvl="3" w:tplc="B60A4AAA">
+    <w:lvl w:ilvl="3" w:tplc="DF44EE0A">
       <w:start w:val="1"/>
       <w:numFmt w:val="bullet"/>
       <w:lvlText w:val="●"/>
@@ -4733,7 +4836,7 @@
         <w:ind w:left="2880" w:hanging="360"/>
       </w:pPr>
     </w:lvl>
-    <w:lvl w:ilvl="4" w:tplc="CC685894">
+    <w:lvl w:ilvl="4" w:tplc="A004235C">
       <w:start w:val="1"/>
       <w:numFmt w:val="bullet"/>
       <w:lvlText w:val="○"/>
@@ -4742,7 +4845,7 @@
         <w:ind w:left="3600" w:hanging="360"/>
       </w:pPr>
     </w:lvl>
-    <w:lvl w:ilvl="5" w:tplc="AFC6C132">
+    <w:lvl w:ilvl="5" w:tplc="EEC82CB8">
       <w:start w:val="1"/>
       <w:numFmt w:val="bullet"/>
       <w:lvlText w:val="■"/>
@@ -4751,7 +4854,7 @@
         <w:ind w:left="4320" w:hanging="360"/>
       </w:pPr>
     </w:lvl>
-    <w:lvl w:ilvl="6" w:tplc="247C0676">
+    <w:lvl w:ilvl="6" w:tplc="01542A40">
       <w:start w:val="1"/>
       <w:numFmt w:val="bullet"/>
       <w:lvlText w:val="●"/>
@@ -4760,7 +4863,7 @@
         <w:ind w:left="5040" w:hanging="360"/>
       </w:pPr>
     </w:lvl>
-    <w:lvl w:ilvl="7" w:tplc="3D44C5B8">
+    <w:lvl w:ilvl="7" w:tplc="66183B40">
       <w:start w:val="1"/>
       <w:numFmt w:val="bullet"/>
       <w:lvlText w:val="●"/>
@@ -4769,7 +4872,7 @@
         <w:ind w:left="5760" w:hanging="360"/>
       </w:pPr>
     </w:lvl>
-    <w:lvl w:ilvl="8" w:tplc="DF2419E6">
+    <w:lvl w:ilvl="8" w:tplc="53F2C0C8">
       <w:start w:val="1"/>
       <w:numFmt w:val="bullet"/>
       <w:lvlText w:val="●"/>
@@ -4780,10 +4883,10 @@
     </w:lvl>
   </w:abstractNum>
   <w:abstractNum w:abstractNumId="1" w15:restartNumberingAfterBreak="0">
-    <w:nsid w:val="4B054779"/>
+    <w:nsid w:val="646708E6"/>
     <w:multiLevelType w:val="hybridMultilevel"/>
-    <w:tmpl w:val="3C66843C"/>
-    <w:lvl w:ilvl="0" w:tplc="83E8F4D2">
+    <w:tmpl w:val="26CE24FE"/>
+    <w:lvl w:ilvl="0" w:tplc="94921F4A">
       <w:start w:val="1"/>
       <w:numFmt w:val="decimal"/>
       <w:lvlText w:val="%1."/>
@@ -4792,54 +4895,54 @@
         <w:ind w:left="420" w:hanging="260"/>
       </w:pPr>
     </w:lvl>
-    <w:lvl w:ilvl="1" w:tplc="B858AF4A">
+    <w:lvl w:ilvl="1" w:tplc="9AC62B54">
       <w:numFmt w:val="decimal"/>
       <w:lvlText w:val=""/>
       <w:lvlJc w:val="left"/>
     </w:lvl>
-    <w:lvl w:ilvl="2" w:tplc="58FC3FA6">
+    <w:lvl w:ilvl="2" w:tplc="A8F2E88A">
       <w:numFmt w:val="decimal"/>
       <w:lvlText w:val=""/>
       <w:lvlJc w:val="left"/>
     </w:lvl>
-    <w:lvl w:ilvl="3" w:tplc="21201C0A">
+    <w:lvl w:ilvl="3" w:tplc="B1F6D300">
       <w:numFmt w:val="decimal"/>
       <w:lvlText w:val=""/>
       <w:lvlJc w:val="left"/>
     </w:lvl>
-    <w:lvl w:ilvl="4" w:tplc="112ACA16">
+    <w:lvl w:ilvl="4" w:tplc="4A68EC38">
       <w:numFmt w:val="decimal"/>
       <w:lvlText w:val=""/>
       <w:lvlJc w:val="left"/>
     </w:lvl>
-    <w:lvl w:ilvl="5" w:tplc="25082DFC">
+    <w:lvl w:ilvl="5" w:tplc="B15A6774">
       <w:numFmt w:val="decimal"/>
       <w:lvlText w:val=""/>
       <w:lvlJc w:val="left"/>
     </w:lvl>
-    <w:lvl w:ilvl="6" w:tplc="6F78AA58">
+    <w:lvl w:ilvl="6" w:tplc="3ADECE62">
       <w:numFmt w:val="decimal"/>
       <w:lvlText w:val=""/>
       <w:lvlJc w:val="left"/>
     </w:lvl>
-    <w:lvl w:ilvl="7" w:tplc="96DAD626">
+    <w:lvl w:ilvl="7" w:tplc="3C2E046E">
       <w:numFmt w:val="decimal"/>
       <w:lvlText w:val=""/>
       <w:lvlJc w:val="left"/>
     </w:lvl>
-    <w:lvl w:ilvl="8" w:tplc="EED4C9C4">
+    <w:lvl w:ilvl="8" w:tplc="3F46AD58">
       <w:numFmt w:val="decimal"/>
       <w:lvlText w:val=""/>
       <w:lvlJc w:val="left"/>
     </w:lvl>
   </w:abstractNum>
-  <w:num w:numId="1" w16cid:durableId="2053965707">
+  <w:num w:numId="1" w16cid:durableId="1743602997">
     <w:abstractNumId w:val="0"/>
     <w:lvlOverride w:ilvl="0">
       <w:startOverride w:val="1"/>
     </w:lvlOverride>
   </w:num>
-  <w:num w:numId="2" w16cid:durableId="709037332">
+  <w:num w:numId="2" w16cid:durableId="2078818327">
     <w:abstractNumId w:val="1"/>
     <w:lvlOverride w:ilvl="0">
       <w:startOverride w:val="1"/>

</xml_diff>

<commit_message>
Habilito los modulos del menu segun el plan contratado
</commit_message>
<xml_diff>
--- a/docs/manuales/INVENTRA_Manual_de_Usuario.docx
+++ b/docs/manuales/INVENTRA_Manual_de_Usuario.docx
@@ -145,7 +145,7 @@
           <w:left w:w="10" w:type="dxa"/>
           <w:right w:w="10" w:type="dxa"/>
         </w:tblCellMar>
-        <w:tblLook w:val="04A0" w:firstRow="1" w:lastRow="0" w:firstColumn="1" w:lastColumn="0" w:noHBand="0" w:noVBand="1"/>
+        <w:tblLook w:val="0000" w:firstRow="0" w:lastRow="0" w:firstColumn="0" w:lastColumn="0" w:noHBand="0" w:noVBand="0"/>
       </w:tblPr>
       <w:tblGrid>
         <w:gridCol w:w="1500"/>
@@ -1604,7 +1604,10 @@
       </w:r>
       <w:r>
         <w:lastRenderedPageBreak/>
-        <w:t>resolver una duda puntual, el apartado 9 reúne todos los mensajes que el sistema puede mostrarte y qué significa cada uno.</w:t>
+        <w:t>resolver una duda puntual, el apartado 9 reúne todos los mensajes que el sistema puede mostrarte y qué significa cada uno</w:t>
+      </w:r>
+      <w:r>
+        <w:t>.</w:t>
       </w:r>
     </w:p>
     <w:p>
@@ -1736,7 +1739,7 @@
           <w:left w:w="10" w:type="dxa"/>
           <w:right w:w="10" w:type="dxa"/>
         </w:tblCellMar>
-        <w:tblLook w:val="04A0" w:firstRow="1" w:lastRow="0" w:firstColumn="1" w:lastColumn="0" w:noHBand="0" w:noVBand="1"/>
+        <w:tblLook w:val="0000" w:firstRow="0" w:lastRow="0" w:firstColumn="0" w:lastColumn="0" w:noHBand="0" w:noVBand="0"/>
       </w:tblPr>
       <w:tblGrid>
         <w:gridCol w:w="2600"/>
@@ -1968,7 +1971,7 @@
           <w:noProof/>
         </w:rPr>
         <w:drawing>
-          <wp:inline distT="0" distB="0" distL="0" distR="0" wp14:anchorId="4E2238E5" wp14:editId="11ED825C">
+          <wp:inline distT="0" distB="0" distL="0" distR="0" wp14:anchorId="530BCE56" wp14:editId="06F7928F">
             <wp:extent cx="3619500" cy="2809875"/>
             <wp:effectExtent l="0" t="0" r="0" b="0"/>
             <wp:docPr id="1" name="Imagen 1"/>
@@ -2255,10 +2258,10 @@
           <w:noProof/>
         </w:rPr>
         <w:drawing>
-          <wp:inline distT="0" distB="0" distL="0" distR="0" wp14:anchorId="5FAEBCBE" wp14:editId="4D8B9D23">
+          <wp:inline distT="0" distB="0" distL="0" distR="0" wp14:anchorId="62BE3F34" wp14:editId="378BA421">
             <wp:extent cx="3619500" cy="1828800"/>
             <wp:effectExtent l="0" t="0" r="0" b="0"/>
-            <wp:docPr id="410837931" name="Imagen 410837931"/>
+            <wp:docPr id="1677139999" name="Imagen 1677139999"/>
             <wp:cNvGraphicFramePr>
               <a:graphicFrameLocks xmlns:a="http://schemas.openxmlformats.org/drawingml/2006/main" noChangeAspect="1"/>
             </wp:cNvGraphicFramePr>
@@ -2471,10 +2474,10 @@
           <w:noProof/>
         </w:rPr>
         <w:drawing>
-          <wp:inline distT="0" distB="0" distL="0" distR="0" wp14:anchorId="001838F0" wp14:editId="3C4CEDE9">
+          <wp:inline distT="0" distB="0" distL="0" distR="0" wp14:anchorId="03245198" wp14:editId="235AF243">
             <wp:extent cx="3619500" cy="2438400"/>
             <wp:effectExtent l="0" t="0" r="0" b="0"/>
-            <wp:docPr id="1300667923" name="Imagen 1300667923"/>
+            <wp:docPr id="947770935" name="Imagen 947770935"/>
             <wp:cNvGraphicFramePr>
               <a:graphicFrameLocks xmlns:a="http://schemas.openxmlformats.org/drawingml/2006/main" noChangeAspect="1"/>
             </wp:cNvGraphicFramePr>
@@ -2595,10 +2598,10 @@
           <w:noProof/>
         </w:rPr>
         <w:drawing>
-          <wp:inline distT="0" distB="0" distL="0" distR="0" wp14:anchorId="6E4FC940" wp14:editId="05E8A047">
+          <wp:inline distT="0" distB="0" distL="0" distR="0" wp14:anchorId="730CB71A" wp14:editId="49D94B38">
             <wp:extent cx="3619500" cy="2819400"/>
             <wp:effectExtent l="0" t="0" r="0" b="0"/>
-            <wp:docPr id="1131887128" name="Imagen 1131887128"/>
+            <wp:docPr id="2085850136" name="Imagen 2085850136"/>
             <wp:cNvGraphicFramePr>
               <a:graphicFrameLocks xmlns:a="http://schemas.openxmlformats.org/drawingml/2006/main" noChangeAspect="1"/>
             </wp:cNvGraphicFramePr>
@@ -2750,10 +2753,10 @@
           <w:noProof/>
         </w:rPr>
         <w:drawing>
-          <wp:inline distT="0" distB="0" distL="0" distR="0" wp14:anchorId="4859795E" wp14:editId="2B91E01E">
+          <wp:inline distT="0" distB="0" distL="0" distR="0" wp14:anchorId="3027770A" wp14:editId="750E9059">
             <wp:extent cx="4953000" cy="2476500"/>
             <wp:effectExtent l="0" t="0" r="0" b="0"/>
-            <wp:docPr id="1293211519" name="Imagen 1293211519"/>
+            <wp:docPr id="1616613436" name="Imagen 1616613436"/>
             <wp:cNvGraphicFramePr>
               <a:graphicFrameLocks xmlns:a="http://schemas.openxmlformats.org/drawingml/2006/main" noChangeAspect="1"/>
             </wp:cNvGraphicFramePr>
@@ -2830,7 +2833,26 @@
         <w:t>«Pronto»</w:t>
       </w:r>
       <w:r>
-        <w:t xml:space="preserve"> —Inventario, Ventas, Reportes y Sedes— todavía no están disponibles y por eso aparecen apagados. Cuando cada uno se termine, se activará en este mismo menú y sus indicadores aparecerán en el panel.</w:t>
+        <w:t xml:space="preserve"> todavía no están disponibles y por eso aparecen apagados. Cuando cada uno se termine, se activará en este mismo menú y sus indicadores aparecerán en el panel.</w:t>
+      </w:r>
+    </w:p>
+    <w:p>
+      <w:pPr>
+        <w:spacing w:after="110" w:line="262" w:lineRule="auto"/>
+        <w:jc w:val="both"/>
+      </w:pPr>
+      <w:r>
+        <w:t xml:space="preserve">Los módulos marcados con </w:t>
+      </w:r>
+      <w:r>
+        <w:rPr>
+          <w:b/>
+          <w:bCs/>
+        </w:rPr>
+        <w:t>«Pro»</w:t>
+      </w:r>
+      <w:r>
+        <w:t xml:space="preserve"> no están incluidos en tu plan. Con el plan Básico tu licorera trabaja con una sola sede, de modo que el módulo de sedes aparece así; cambiando al plan Pro se habilita. Durante los quince días de prueba tienes el plan Pro, así que no verás esta marca.</w:t>
       </w:r>
     </w:p>
     <w:p>
@@ -2974,10 +2996,10 @@
           <w:noProof/>
         </w:rPr>
         <w:drawing>
-          <wp:inline distT="0" distB="0" distL="0" distR="0" wp14:anchorId="164FB7FE" wp14:editId="0B523DA1">
+          <wp:inline distT="0" distB="0" distL="0" distR="0" wp14:anchorId="4AC49EBE" wp14:editId="740AB4F7">
             <wp:extent cx="4953000" cy="2447925"/>
             <wp:effectExtent l="0" t="0" r="0" b="0"/>
-            <wp:docPr id="43089609" name="Imagen 43089609"/>
+            <wp:docPr id="1364568496" name="Imagen 1364568496"/>
             <wp:cNvGraphicFramePr>
               <a:graphicFrameLocks xmlns:a="http://schemas.openxmlformats.org/drawingml/2006/main" noChangeAspect="1"/>
             </wp:cNvGraphicFramePr>
@@ -3066,10 +3088,10 @@
           <w:noProof/>
         </w:rPr>
         <w:drawing>
-          <wp:inline distT="0" distB="0" distL="0" distR="0" wp14:anchorId="6D12FF5C" wp14:editId="0CDB5D44">
+          <wp:inline distT="0" distB="0" distL="0" distR="0" wp14:anchorId="59CD4EAE" wp14:editId="3450593B">
             <wp:extent cx="6286500" cy="3124200"/>
             <wp:effectExtent l="0" t="0" r="0" b="0"/>
-            <wp:docPr id="892947557" name="Imagen 892947557"/>
+            <wp:docPr id="258574231" name="Imagen 258574231"/>
             <wp:cNvGraphicFramePr>
               <a:graphicFrameLocks xmlns:a="http://schemas.openxmlformats.org/drawingml/2006/main" noChangeAspect="1"/>
             </wp:cNvGraphicFramePr>
@@ -3297,10 +3319,10 @@
           <w:noProof/>
         </w:rPr>
         <w:drawing>
-          <wp:inline distT="0" distB="0" distL="0" distR="0" wp14:anchorId="5695C275" wp14:editId="4A51EAA7">
+          <wp:inline distT="0" distB="0" distL="0" distR="0" wp14:anchorId="097BF51E" wp14:editId="73773AB7">
             <wp:extent cx="4953000" cy="2438400"/>
             <wp:effectExtent l="0" t="0" r="0" b="0"/>
-            <wp:docPr id="725360277" name="Imagen 725360277"/>
+            <wp:docPr id="363783356" name="Imagen 363783356"/>
             <wp:cNvGraphicFramePr>
               <a:graphicFrameLocks xmlns:a="http://schemas.openxmlformats.org/drawingml/2006/main" noChangeAspect="1"/>
             </wp:cNvGraphicFramePr>
@@ -3503,10 +3525,10 @@
           <w:noProof/>
         </w:rPr>
         <w:drawing>
-          <wp:inline distT="0" distB="0" distL="0" distR="0" wp14:anchorId="43A3F4F0" wp14:editId="03F88717">
+          <wp:inline distT="0" distB="0" distL="0" distR="0" wp14:anchorId="40146EE0" wp14:editId="6AEE4C88">
             <wp:extent cx="6286500" cy="3162300"/>
             <wp:effectExtent l="0" t="0" r="0" b="0"/>
-            <wp:docPr id="1949818482" name="Imagen 1949818482"/>
+            <wp:docPr id="1124937204" name="Imagen 1124937204"/>
             <wp:cNvGraphicFramePr>
               <a:graphicFrameLocks xmlns:a="http://schemas.openxmlformats.org/drawingml/2006/main" noChangeAspect="1"/>
             </wp:cNvGraphicFramePr>
@@ -3667,10 +3689,10 @@
         </w:rPr>
         <w:lastRenderedPageBreak/>
         <w:drawing>
-          <wp:inline distT="0" distB="0" distL="0" distR="0" wp14:anchorId="7063200B" wp14:editId="25D14A06">
+          <wp:inline distT="0" distB="0" distL="0" distR="0" wp14:anchorId="52FAF058" wp14:editId="7FE35261">
             <wp:extent cx="6286500" cy="3124200"/>
             <wp:effectExtent l="0" t="0" r="0" b="0"/>
-            <wp:docPr id="45847447" name="Imagen 45847447"/>
+            <wp:docPr id="559486358" name="Imagen 559486358"/>
             <wp:cNvGraphicFramePr>
               <a:graphicFrameLocks xmlns:a="http://schemas.openxmlformats.org/drawingml/2006/main" noChangeAspect="1"/>
             </wp:cNvGraphicFramePr>
@@ -3776,7 +3798,7 @@
           <w:left w:w="10" w:type="dxa"/>
           <w:right w:w="10" w:type="dxa"/>
         </w:tblCellMar>
-        <w:tblLook w:val="04A0" w:firstRow="1" w:lastRow="0" w:firstColumn="1" w:lastColumn="0" w:noHBand="0" w:noVBand="1"/>
+        <w:tblLook w:val="0000" w:firstRow="0" w:lastRow="0" w:firstColumn="0" w:lastColumn="0" w:noHBand="0" w:noVBand="0"/>
       </w:tblPr>
       <w:tblGrid>
         <w:gridCol w:w="2900"/>
@@ -4661,10 +4683,7 @@
         <w:t xml:space="preserve">Perdí el acceso al correo con el que me registré. </w:t>
       </w:r>
       <w:r>
-        <w:t>Pídele al administrador de tu licorera que te cambie el correo desde la pantalla de usuarios. Si el que perdió el acceso es el administrador, hay que escribir al soporte de INVENTRA</w:t>
-      </w:r>
-      <w:r>
-        <w:t>.</w:t>
+        <w:t>Pídele al administrador de tu licorera que te cambie el correo desde la pantalla de usuarios. Si el que perdió el acceso es el administrador, hay que escribir al soporte de INVENTRA.</w:t>
       </w:r>
     </w:p>
     <w:p>
@@ -4797,10 +4816,10 @@
 <file path=word/numbering.xml><?xml version="1.0" encoding="utf-8"?>
 <w:numbering xmlns:wpc="http://schemas.microsoft.com/office/word/2010/wordprocessingCanvas" xmlns:cx="http://schemas.microsoft.com/office/drawing/2014/chartex" xmlns:cx1="http://schemas.microsoft.com/office/drawing/2015/9/8/chartex" xmlns:cx2="http://schemas.microsoft.com/office/drawing/2015/10/21/chartex" xmlns:cx3="http://schemas.microsoft.com/office/drawing/2016/5/9/chartex" xmlns:cx4="http://schemas.microsoft.com/office/drawing/2016/5/10/chartex" xmlns:cx5="http://schemas.microsoft.com/office/drawing/2016/5/11/chartex" xmlns:cx6="http://schemas.microsoft.com/office/drawing/2016/5/12/chartex" xmlns:cx7="http://schemas.microsoft.com/office/drawing/2016/5/13/chartex" xmlns:cx8="http://schemas.microsoft.com/office/drawing/2016/5/14/chartex" xmlns:mc="http://schemas.openxmlformats.org/markup-compatibility/2006" xmlns:aink="http://schemas.microsoft.com/office/drawing/2016/ink" xmlns:am3d="http://schemas.microsoft.com/office/drawing/2017/model3d" xmlns:o="urn:schemas-microsoft-com:office:office" xmlns:oel="http://schemas.microsoft.com/office/2019/extlst" xmlns:r="http://schemas.openxmlformats.org/officeDocument/2006/relationships" xmlns:m="http://schemas.openxmlformats.org/officeDocument/2006/math" xmlns:v="urn:schemas-microsoft-com:vml" xmlns:wp14="http://schemas.microsoft.com/office/word/2010/wordprocessingDrawing" xmlns:wp="http://schemas.openxmlformats.org/drawingml/2006/wordprocessingDrawing" xmlns:w10="urn:schemas-microsoft-com:office:word" xmlns:w="http://schemas.openxmlformats.org/wordprocessingml/2006/main" xmlns:w14="http://schemas.microsoft.com/office/word/2010/wordml" xmlns:w15="http://schemas.microsoft.com/office/word/2012/wordml" xmlns:w16cex="http://schemas.microsoft.com/office/word/2018/wordml/cex" xmlns:w16cid="http://schemas.microsoft.com/office/word/2016/wordml/cid" xmlns:w16="http://schemas.microsoft.com/office/word/2018/wordml" xmlns:w16du="http://schemas.microsoft.com/office/word/2023/wordml/word16du" xmlns:w16sdtdh="http://schemas.microsoft.com/office/word/2020/wordml/sdtdatahash" xmlns:w16sdtfl="http://schemas.microsoft.com/office/word/2024/wordml/sdtformatlock" xmlns:w16se="http://schemas.microsoft.com/office/word/2015/wordml/symex" xmlns:wpg="http://schemas.microsoft.com/office/word/2010/wordprocessingGroup" xmlns:wpi="http://schemas.microsoft.com/office/word/2010/wordprocessingInk" xmlns:wne="http://schemas.microsoft.com/office/word/2006/wordml" xmlns:wps="http://schemas.microsoft.com/office/word/2010/wordprocessingShape" mc:Ignorable="w14 w15 w16se w16cid w16 w16cex w16sdtdh w16sdtfl w16du wp14">
   <w:abstractNum w:abstractNumId="0" w15:restartNumberingAfterBreak="0">
-    <w:nsid w:val="13294C58"/>
+    <w:nsid w:val="0E045750"/>
     <w:multiLevelType w:val="hybridMultilevel"/>
-    <w:tmpl w:val="99D28E80"/>
-    <w:lvl w:ilvl="0" w:tplc="32229D9E">
+    <w:tmpl w:val="BDEEEE8C"/>
+    <w:lvl w:ilvl="0" w:tplc="356A852A">
       <w:start w:val="1"/>
       <w:numFmt w:val="bullet"/>
       <w:lvlText w:val="●"/>
@@ -4809,7 +4828,7 @@
         <w:ind w:left="720" w:hanging="360"/>
       </w:pPr>
     </w:lvl>
-    <w:lvl w:ilvl="1" w:tplc="580EA7BC">
+    <w:lvl w:ilvl="1" w:tplc="38C097CA">
       <w:start w:val="1"/>
       <w:numFmt w:val="bullet"/>
       <w:lvlText w:val="○"/>
@@ -4818,7 +4837,7 @@
         <w:ind w:left="1440" w:hanging="360"/>
       </w:pPr>
     </w:lvl>
-    <w:lvl w:ilvl="2" w:tplc="79D425B4">
+    <w:lvl w:ilvl="2" w:tplc="95008CE4">
       <w:start w:val="1"/>
       <w:numFmt w:val="bullet"/>
       <w:lvlText w:val="■"/>
@@ -4827,7 +4846,7 @@
         <w:ind w:left="2160" w:hanging="360"/>
       </w:pPr>
     </w:lvl>
-    <w:lvl w:ilvl="3" w:tplc="DF44EE0A">
+    <w:lvl w:ilvl="3" w:tplc="A58204B8">
       <w:start w:val="1"/>
       <w:numFmt w:val="bullet"/>
       <w:lvlText w:val="●"/>
@@ -4836,7 +4855,7 @@
         <w:ind w:left="2880" w:hanging="360"/>
       </w:pPr>
     </w:lvl>
-    <w:lvl w:ilvl="4" w:tplc="A004235C">
+    <w:lvl w:ilvl="4" w:tplc="57E2016E">
       <w:start w:val="1"/>
       <w:numFmt w:val="bullet"/>
       <w:lvlText w:val="○"/>
@@ -4845,7 +4864,7 @@
         <w:ind w:left="3600" w:hanging="360"/>
       </w:pPr>
     </w:lvl>
-    <w:lvl w:ilvl="5" w:tplc="EEC82CB8">
+    <w:lvl w:ilvl="5" w:tplc="2E3AE248">
       <w:start w:val="1"/>
       <w:numFmt w:val="bullet"/>
       <w:lvlText w:val="■"/>
@@ -4854,7 +4873,7 @@
         <w:ind w:left="4320" w:hanging="360"/>
       </w:pPr>
     </w:lvl>
-    <w:lvl w:ilvl="6" w:tplc="01542A40">
+    <w:lvl w:ilvl="6" w:tplc="7EF87B8C">
       <w:start w:val="1"/>
       <w:numFmt w:val="bullet"/>
       <w:lvlText w:val="●"/>
@@ -4863,7 +4882,7 @@
         <w:ind w:left="5040" w:hanging="360"/>
       </w:pPr>
     </w:lvl>
-    <w:lvl w:ilvl="7" w:tplc="66183B40">
+    <w:lvl w:ilvl="7" w:tplc="3C06384C">
       <w:start w:val="1"/>
       <w:numFmt w:val="bullet"/>
       <w:lvlText w:val="●"/>
@@ -4872,7 +4891,7 @@
         <w:ind w:left="5760" w:hanging="360"/>
       </w:pPr>
     </w:lvl>
-    <w:lvl w:ilvl="8" w:tplc="53F2C0C8">
+    <w:lvl w:ilvl="8" w:tplc="096CB88E">
       <w:start w:val="1"/>
       <w:numFmt w:val="bullet"/>
       <w:lvlText w:val="●"/>
@@ -4883,10 +4902,10 @@
     </w:lvl>
   </w:abstractNum>
   <w:abstractNum w:abstractNumId="1" w15:restartNumberingAfterBreak="0">
-    <w:nsid w:val="646708E6"/>
+    <w:nsid w:val="1F7D4883"/>
     <w:multiLevelType w:val="hybridMultilevel"/>
-    <w:tmpl w:val="26CE24FE"/>
-    <w:lvl w:ilvl="0" w:tplc="94921F4A">
+    <w:tmpl w:val="2BFCD464"/>
+    <w:lvl w:ilvl="0" w:tplc="B6788CC8">
       <w:start w:val="1"/>
       <w:numFmt w:val="decimal"/>
       <w:lvlText w:val="%1."/>
@@ -4895,54 +4914,54 @@
         <w:ind w:left="420" w:hanging="260"/>
       </w:pPr>
     </w:lvl>
-    <w:lvl w:ilvl="1" w:tplc="9AC62B54">
+    <w:lvl w:ilvl="1" w:tplc="6CACA05C">
       <w:numFmt w:val="decimal"/>
       <w:lvlText w:val=""/>
       <w:lvlJc w:val="left"/>
     </w:lvl>
-    <w:lvl w:ilvl="2" w:tplc="A8F2E88A">
+    <w:lvl w:ilvl="2" w:tplc="92E8473C">
       <w:numFmt w:val="decimal"/>
       <w:lvlText w:val=""/>
       <w:lvlJc w:val="left"/>
     </w:lvl>
-    <w:lvl w:ilvl="3" w:tplc="B1F6D300">
+    <w:lvl w:ilvl="3" w:tplc="39224D2A">
       <w:numFmt w:val="decimal"/>
       <w:lvlText w:val=""/>
       <w:lvlJc w:val="left"/>
     </w:lvl>
-    <w:lvl w:ilvl="4" w:tplc="4A68EC38">
+    <w:lvl w:ilvl="4" w:tplc="C7E2A0A4">
       <w:numFmt w:val="decimal"/>
       <w:lvlText w:val=""/>
       <w:lvlJc w:val="left"/>
     </w:lvl>
-    <w:lvl w:ilvl="5" w:tplc="B15A6774">
+    <w:lvl w:ilvl="5" w:tplc="5A0266A0">
       <w:numFmt w:val="decimal"/>
       <w:lvlText w:val=""/>
       <w:lvlJc w:val="left"/>
     </w:lvl>
-    <w:lvl w:ilvl="6" w:tplc="3ADECE62">
+    <w:lvl w:ilvl="6" w:tplc="9EA6D86E">
       <w:numFmt w:val="decimal"/>
       <w:lvlText w:val=""/>
       <w:lvlJc w:val="left"/>
     </w:lvl>
-    <w:lvl w:ilvl="7" w:tplc="3C2E046E">
+    <w:lvl w:ilvl="7" w:tplc="84DA2782">
       <w:numFmt w:val="decimal"/>
       <w:lvlText w:val=""/>
       <w:lvlJc w:val="left"/>
     </w:lvl>
-    <w:lvl w:ilvl="8" w:tplc="3F46AD58">
+    <w:lvl w:ilvl="8" w:tplc="0A2A4494">
       <w:numFmt w:val="decimal"/>
       <w:lvlText w:val=""/>
       <w:lvlJc w:val="left"/>
     </w:lvl>
   </w:abstractNum>
-  <w:num w:numId="1" w16cid:durableId="1743602997">
+  <w:num w:numId="1" w16cid:durableId="962151701">
     <w:abstractNumId w:val="0"/>
     <w:lvlOverride w:ilvl="0">
       <w:startOverride w:val="1"/>
     </w:lvlOverride>
   </w:num>
-  <w:num w:numId="2" w16cid:durableId="2078818327">
+  <w:num w:numId="2" w16cid:durableId="830028318">
     <w:abstractNumId w:val="1"/>
     <w:lvlOverride w:ilvl="0">
       <w:startOverride w:val="1"/>

</xml_diff>

<commit_message>
Documento el modulo de suscripciones en el manual de usuari con las modificaciones necesarias para dar coherencia al mismo. Se agruparon cambios que incluyen los tres avisos del panel con su captura, el cambio de plan y lo que se puede hacer con la suscripcion suspendida
</commit_message>
<xml_diff>
--- a/docs/manuales/INVENTRA_Manual_de_Usuario.docx
+++ b/docs/manuales/INVENTRA_Manual_de_Usuario.docx
@@ -145,7 +145,7 @@
           <w:left w:w="10" w:type="dxa"/>
           <w:right w:w="10" w:type="dxa"/>
         </w:tblCellMar>
-        <w:tblLook w:val="04A0" w:firstRow="1" w:lastRow="0" w:firstColumn="1" w:lastColumn="0" w:noHBand="0" w:noVBand="1"/>
+        <w:tblLook w:val="0000" w:firstRow="0" w:lastRow="0" w:firstColumn="0" w:lastColumn="0" w:noHBand="0" w:noVBand="0"/>
       </w:tblPr>
       <w:tblGrid>
         <w:gridCol w:w="1500"/>
@@ -1430,7 +1430,7 @@
             <w:sz w:val="21"/>
             <w:szCs w:val="21"/>
           </w:rPr>
-          <w:t>9. Mensajes del sistema</w:t>
+          <w:t>9. Tu suscripción</w:t>
         </w:r>
       </w:hyperlink>
       <w:r>
@@ -1465,8 +1465,184 @@
           <w:tab w:val="right" w:leader="dot" w:pos="9200"/>
         </w:tabs>
         <w:spacing w:after="40" w:line="252" w:lineRule="auto"/>
+        <w:ind w:left="360"/>
       </w:pPr>
       <w:hyperlink w:anchor="bm25" w:history="1">
+        <w:r>
+          <w:rPr>
+            <w:color w:val="1F3864"/>
+            <w:sz w:val="20"/>
+            <w:szCs w:val="20"/>
+          </w:rPr>
+          <w:t>9.1 Tu plan y hasta cuándo está vigente</w:t>
+        </w:r>
+      </w:hyperlink>
+      <w:r>
+        <w:rPr>
+          <w:sz w:val="20"/>
+          <w:szCs w:val="20"/>
+        </w:rPr>
+        <w:tab/>
+      </w:r>
+      <w:r>
+        <w:fldChar w:fldCharType="begin"/>
+      </w:r>
+      <w:r>
+        <w:instrText>PAGEREF bm25</w:instrText>
+      </w:r>
+      <w:r>
+        <w:fldChar w:fldCharType="separate"/>
+      </w:r>
+      <w:r>
+        <w:rPr>
+          <w:noProof/>
+        </w:rPr>
+        <w:t>1</w:t>
+      </w:r>
+      <w:r>
+        <w:fldChar w:fldCharType="end"/>
+      </w:r>
+    </w:p>
+    <w:p>
+      <w:pPr>
+        <w:tabs>
+          <w:tab w:val="right" w:leader="dot" w:pos="9200"/>
+        </w:tabs>
+        <w:spacing w:after="40" w:line="252" w:lineRule="auto"/>
+        <w:ind w:left="360"/>
+      </w:pPr>
+      <w:hyperlink w:anchor="bm26" w:history="1">
+        <w:r>
+          <w:rPr>
+            <w:color w:val="1F3864"/>
+            <w:sz w:val="20"/>
+            <w:szCs w:val="20"/>
+          </w:rPr>
+          <w:t>9.2 Los avisos del panel</w:t>
+        </w:r>
+      </w:hyperlink>
+      <w:r>
+        <w:rPr>
+          <w:sz w:val="20"/>
+          <w:szCs w:val="20"/>
+        </w:rPr>
+        <w:tab/>
+      </w:r>
+      <w:r>
+        <w:fldChar w:fldCharType="begin"/>
+      </w:r>
+      <w:r>
+        <w:instrText>PAGEREF bm26</w:instrText>
+      </w:r>
+      <w:r>
+        <w:fldChar w:fldCharType="separate"/>
+      </w:r>
+      <w:r>
+        <w:rPr>
+          <w:noProof/>
+        </w:rPr>
+        <w:t>1</w:t>
+      </w:r>
+      <w:r>
+        <w:fldChar w:fldCharType="end"/>
+      </w:r>
+    </w:p>
+    <w:p>
+      <w:pPr>
+        <w:tabs>
+          <w:tab w:val="right" w:leader="dot" w:pos="9200"/>
+        </w:tabs>
+        <w:spacing w:after="40" w:line="252" w:lineRule="auto"/>
+        <w:ind w:left="360"/>
+      </w:pPr>
+      <w:hyperlink w:anchor="bm27" w:history="1">
+        <w:r>
+          <w:rPr>
+            <w:color w:val="1F3864"/>
+            <w:sz w:val="20"/>
+            <w:szCs w:val="20"/>
+          </w:rPr>
+          <w:t>9.3 Cambiar de plan</w:t>
+        </w:r>
+      </w:hyperlink>
+      <w:r>
+        <w:rPr>
+          <w:sz w:val="20"/>
+          <w:szCs w:val="20"/>
+        </w:rPr>
+        <w:tab/>
+      </w:r>
+      <w:r>
+        <w:fldChar w:fldCharType="begin"/>
+      </w:r>
+      <w:r>
+        <w:instrText>PAGEREF bm27</w:instrText>
+      </w:r>
+      <w:r>
+        <w:fldChar w:fldCharType="separate"/>
+      </w:r>
+      <w:r>
+        <w:rPr>
+          <w:noProof/>
+        </w:rPr>
+        <w:t>1</w:t>
+      </w:r>
+      <w:r>
+        <w:fldChar w:fldCharType="end"/>
+      </w:r>
+    </w:p>
+    <w:p>
+      <w:pPr>
+        <w:tabs>
+          <w:tab w:val="right" w:leader="dot" w:pos="9200"/>
+        </w:tabs>
+        <w:spacing w:after="40" w:line="252" w:lineRule="auto"/>
+        <w:ind w:left="360"/>
+      </w:pPr>
+      <w:hyperlink w:anchor="bm28" w:history="1">
+        <w:r>
+          <w:rPr>
+            <w:color w:val="1F3864"/>
+            <w:sz w:val="20"/>
+            <w:szCs w:val="20"/>
+          </w:rPr>
+          <w:t>9.4 Si tu suscripción deja de estar vigente</w:t>
+        </w:r>
+      </w:hyperlink>
+      <w:r>
+        <w:rPr>
+          <w:sz w:val="20"/>
+          <w:szCs w:val="20"/>
+        </w:rPr>
+        <w:tab/>
+      </w:r>
+      <w:r>
+        <w:fldChar w:fldCharType="begin"/>
+      </w:r>
+      <w:r>
+        <w:instrText>PAGEREF bm28</w:instrText>
+      </w:r>
+      <w:r>
+        <w:fldChar w:fldCharType="separate"/>
+      </w:r>
+      <w:r>
+        <w:rPr>
+          <w:noProof/>
+        </w:rPr>
+        <w:t>1</w:t>
+      </w:r>
+      <w:r>
+        <w:fldChar w:fldCharType="end"/>
+      </w:r>
+    </w:p>
+    <w:p>
+      <w:pPr>
+        <w:tabs>
+          <w:tab w:val="right" w:leader="dot" w:pos="9200"/>
+        </w:tabs>
+        <w:spacing w:after="40" w:line="252" w:lineRule="auto"/>
+      </w:pPr>
+      <w:hyperlink w:anchor="bm29" w:history="1">
         <w:r>
           <w:rPr>
             <w:b/>
@@ -1475,7 +1651,7 @@
             <w:sz w:val="21"/>
             <w:szCs w:val="21"/>
           </w:rPr>
-          <w:t>10. Preguntas frecuentes</w:t>
+          <w:t>10. Mensajes del sistema</w:t>
         </w:r>
       </w:hyperlink>
       <w:r>
@@ -1489,7 +1665,52 @@
         <w:fldChar w:fldCharType="begin"/>
       </w:r>
       <w:r>
-        <w:instrText>PAGEREF bm25</w:instrText>
+        <w:instrText>PAGEREF bm29</w:instrText>
+      </w:r>
+      <w:r>
+        <w:fldChar w:fldCharType="separate"/>
+      </w:r>
+      <w:r>
+        <w:rPr>
+          <w:noProof/>
+        </w:rPr>
+        <w:t>1</w:t>
+      </w:r>
+      <w:r>
+        <w:fldChar w:fldCharType="end"/>
+      </w:r>
+    </w:p>
+    <w:p>
+      <w:pPr>
+        <w:tabs>
+          <w:tab w:val="right" w:leader="dot" w:pos="9200"/>
+        </w:tabs>
+        <w:spacing w:after="40" w:line="252" w:lineRule="auto"/>
+      </w:pPr>
+      <w:hyperlink w:anchor="bm30" w:history="1">
+        <w:r>
+          <w:rPr>
+            <w:b/>
+            <w:bCs/>
+            <w:color w:val="1F3864"/>
+            <w:sz w:val="21"/>
+            <w:szCs w:val="21"/>
+          </w:rPr>
+          <w:t>11. Preguntas frecuentes</w:t>
+        </w:r>
+      </w:hyperlink>
+      <w:r>
+        <w:rPr>
+          <w:sz w:val="20"/>
+          <w:szCs w:val="20"/>
+        </w:rPr>
+        <w:tab/>
+      </w:r>
+      <w:r>
+        <w:fldChar w:fldCharType="begin"/>
+      </w:r>
+      <w:r>
+        <w:instrText>PAGEREF bm30</w:instrText>
       </w:r>
       <w:r>
         <w:fldChar w:fldCharType="separate"/>
@@ -1537,7 +1758,10 @@
         <w:jc w:val="both"/>
       </w:pPr>
       <w:r>
-        <w:t>Este manual explica, paso a paso, cómo usar el sistema. Está escrito para el dueño del negocio y para sus empleados, no para personal técnico: no hace falta saber de computadores más allá de manejar un navegador.</w:t>
+        <w:t>Este manual explica, paso a paso, cómo usar el sistema. Está escrito para el dueño del negocio y para sus empleados, no para personal técnico: no hace falta saber de computadores más allá de manejar un navegador</w:t>
+      </w:r>
+      <w:r>
+        <w:t>.</w:t>
       </w:r>
     </w:p>
     <w:p>
@@ -1590,6 +1814,7 @@
           <w:sz w:val="23"/>
           <w:szCs w:val="23"/>
         </w:rPr>
+        <w:lastRenderedPageBreak/>
         <w:t>1.2 Cómo leerlo</w:t>
       </w:r>
       <w:bookmarkEnd w:id="2"/>
@@ -1600,14 +1825,7 @@
         <w:jc w:val="both"/>
       </w:pPr>
       <w:r>
-        <w:t xml:space="preserve">Cada apartado corresponde a una pantalla y sigue el mismo orden: primero la imagen de la pantalla, después los pasos numerados y, al final, las advertencias que conviene tener presentes. Si solo necesitas </w:t>
-      </w:r>
-      <w:r>
-        <w:lastRenderedPageBreak/>
-        <w:t>resolver una duda puntual, el apartado 9 reúne todos los mensajes que el sistema puede mostrarte y qué significa cada uno</w:t>
-      </w:r>
-      <w:r>
-        <w:t>.</w:t>
+        <w:t>Cada apartado corresponde a una pantalla y sigue el mismo orden: primero la imagen de la pantalla, después los pasos numerados y, al final, las advertencias que conviene tener presentes. Si solo necesitas resolver una duda puntual, el apartado 9 reúne todos los mensajes que el sistema puede mostrarte y qué significa cada uno.</w:t>
       </w:r>
     </w:p>
     <w:p>
@@ -1739,7 +1957,7 @@
           <w:left w:w="10" w:type="dxa"/>
           <w:right w:w="10" w:type="dxa"/>
         </w:tblCellMar>
-        <w:tblLook w:val="04A0" w:firstRow="1" w:lastRow="0" w:firstColumn="1" w:lastColumn="0" w:noHBand="0" w:noVBand="1"/>
+        <w:tblLook w:val="0000" w:firstRow="0" w:lastRow="0" w:firstColumn="0" w:lastColumn="0" w:noHBand="0" w:noVBand="0"/>
       </w:tblPr>
       <w:tblGrid>
         <w:gridCol w:w="2600"/>
@@ -1971,7 +2189,7 @@
           <w:noProof/>
         </w:rPr>
         <w:drawing>
-          <wp:inline distT="0" distB="0" distL="0" distR="0" wp14:anchorId="4A6700EA" wp14:editId="6C9AF82F">
+          <wp:inline distT="0" distB="0" distL="0" distR="0" wp14:anchorId="1E425DBC" wp14:editId="7312A912">
             <wp:extent cx="3619500" cy="2809875"/>
             <wp:effectExtent l="0" t="0" r="0" b="0"/>
             <wp:docPr id="1" name="Imagen 1"/>
@@ -2183,7 +2401,7 @@
         <w:t xml:space="preserve">Los primeros quince días son de prueba. </w:t>
       </w:r>
       <w:r>
-        <w:t>Al crear la cuenta, tu licorera empieza un período de prueba gratuito de quince días con todas las funciones disponibles: son las del plan Pro. En el panel principal verás cuántos días te quedan. Durante la prueba no se puede cambiar de plan; eliges el tuyo al terminar. Si entonces eliges el plan Básico, ten en cuenta que tu licorera pasa a trabajar con un solo usuario y sin sedes, facturación electrónica ni reportes avanzados. Si al terminar no has contratado un plan, tu información se conserva y la podrás seguir consultando, pero el sistema dejará de admitir registros nuevos hasta que contrates.</w:t>
+        <w:t>Al crear la cuenta, tu licorera empieza un período de prueba gratuito de quince días con todas las funciones disponibles: son las del plan Pro. En el panel principal verás cuántos días te quedan. Durante la prueba no se puede cambiar de plan; eliges el tuyo al terminar. Si entonces eliges el plan Básico, ten en cuenta que tu licorera pasa a trabajar con un solo usuario y sin sedes, facturación electrónica ni reportes avanzados. Si al terminar no has contratado un plan, tu información se conserva y la podrás seguir consultando, pero el sistema dejará de admitir registros nuevos hasta que contrates. Todo lo relativo al plan —dónde consultarlo, los avisos y cómo cambiarlo— está reunido en el capítulo 9.</w:t>
       </w:r>
     </w:p>
     <w:p>
@@ -2212,56 +2430,24 @@
           <w:b/>
           <w:bCs/>
         </w:rPr>
-        <w:t xml:space="preserve">Dónde ves tu suscripción. </w:t>
-      </w:r>
-      <w:r>
-        <w:t xml:space="preserve">En el panel principal, el botón «Mi suscripción» te lleva a una pantalla con tu plan, hasta cuándo está vigente y cuántos días quedan. Desde ahí puedes pasarte tú mismo a un plan más económico; para subir de plan, comunícate con nosotros y lo activamos al confirmar el pago. Si al </w:t>
+        <w:t xml:space="preserve">Confirma tu correo antes de empezar. </w:t>
+      </w:r>
+      <w:r>
+        <w:t xml:space="preserve">Al registrarte recibirás un mensaje con un enlace. Mientras no lo abras puedes entrar y consultar todo, pero </w:t>
+      </w:r>
+      <w:r>
+        <w:rPr>
+          <w:b/>
+          <w:bCs/>
+        </w:rPr>
+        <w:t>el sistema no te dejará registrar información</w:t>
+      </w:r>
+      <w:r>
+        <w:t xml:space="preserve">: ni cuentas, ni </w:t>
       </w:r>
       <w:r>
         <w:lastRenderedPageBreak/>
-        <w:t>bajar tienes más usuarios de los que admite el plan nuevo, el sistema te lo dice y no cambia nada: inactiva los que no necesites y vuelve a intentarlo.</w:t>
-      </w:r>
-    </w:p>
-    <w:p>
-      <w:pPr>
-        <w:spacing w:after="110" w:line="262" w:lineRule="auto"/>
-        <w:jc w:val="both"/>
-      </w:pPr>
-      <w:r>
-        <w:rPr>
-          <w:b/>
-          <w:bCs/>
-        </w:rPr>
-        <w:t xml:space="preserve">Cuando tu plan está por vencer. </w:t>
-      </w:r>
-      <w:r>
-        <w:t>Tres días antes de la fecha de vencimiento, el panel principal te avisa. Si la fecha pasa sin que renueves, tu licorera sigue funcionando con normalidad cuatro días más, con un aviso de pago a la vista. Pasados esos cuatro días tu información se conserva y la podrás seguir consultando, pero el sistema dejará de admitir registros nuevos hasta que renueves. Cada vez que se registre una fecha de vencimiento nueva, recibirás un correo con esa fecha; si no es la que acordaste, avísanos.</w:t>
-      </w:r>
-    </w:p>
-    <w:p>
-      <w:pPr>
-        <w:spacing w:after="110" w:line="262" w:lineRule="auto"/>
-        <w:jc w:val="both"/>
-      </w:pPr>
-      <w:r>
-        <w:rPr>
-          <w:b/>
-          <w:bCs/>
-        </w:rPr>
-        <w:t xml:space="preserve">Confirma tu correo antes de empezar. </w:t>
-      </w:r>
-      <w:r>
-        <w:t xml:space="preserve">Al registrarte recibirás un mensaje con un enlace. Mientras no lo abras puedes entrar y consultar todo, pero </w:t>
-      </w:r>
-      <w:r>
-        <w:rPr>
-          <w:b/>
-          <w:bCs/>
-        </w:rPr>
-        <w:t>el sistema no te dejará registrar información</w:t>
-      </w:r>
-      <w:r>
-        <w:t xml:space="preserve">: ni cuentas, ni productos, ni ventas. Verás un aviso en la parte de arriba recordándotelo; si el mensaje no llegó o ya venció, ese mismo aviso tiene el botón </w:t>
+        <w:t xml:space="preserve">productos, ni ventas. Verás un aviso en la parte de arriba recordándotelo; si el mensaje no llegó o ya venció, ese mismo aviso tiene el botón </w:t>
       </w:r>
       <w:r>
         <w:rPr>
@@ -2304,10 +2490,10 @@
           <w:noProof/>
         </w:rPr>
         <w:drawing>
-          <wp:inline distT="0" distB="0" distL="0" distR="0" wp14:anchorId="1030017D" wp14:editId="1CB5C6CB">
+          <wp:inline distT="0" distB="0" distL="0" distR="0" wp14:anchorId="2DED0516" wp14:editId="78E8E60B">
             <wp:extent cx="3619500" cy="1828800"/>
             <wp:effectExtent l="0" t="0" r="0" b="0"/>
-            <wp:docPr id="1433407739" name="Imagen 1433407739"/>
+            <wp:docPr id="827558635" name="Imagen 827558635"/>
             <wp:cNvGraphicFramePr>
               <a:graphicFrameLocks xmlns:a="http://schemas.openxmlformats.org/drawingml/2006/main" noChangeAspect="1"/>
             </wp:cNvGraphicFramePr>
@@ -2520,10 +2706,10 @@
           <w:noProof/>
         </w:rPr>
         <w:drawing>
-          <wp:inline distT="0" distB="0" distL="0" distR="0" wp14:anchorId="04981DEF" wp14:editId="5AC1188A">
+          <wp:inline distT="0" distB="0" distL="0" distR="0" wp14:anchorId="19CE3806" wp14:editId="1747F3C2">
             <wp:extent cx="3619500" cy="2438400"/>
             <wp:effectExtent l="0" t="0" r="0" b="0"/>
-            <wp:docPr id="159630917" name="Imagen 159630917"/>
+            <wp:docPr id="540276827" name="Imagen 540276827"/>
             <wp:cNvGraphicFramePr>
               <a:graphicFrameLocks xmlns:a="http://schemas.openxmlformats.org/drawingml/2006/main" noChangeAspect="1"/>
             </wp:cNvGraphicFramePr>
@@ -2644,10 +2830,10 @@
           <w:noProof/>
         </w:rPr>
         <w:drawing>
-          <wp:inline distT="0" distB="0" distL="0" distR="0" wp14:anchorId="3CD7413F" wp14:editId="28EEE2EF">
+          <wp:inline distT="0" distB="0" distL="0" distR="0" wp14:anchorId="3E5F0815" wp14:editId="5EC5E6B8">
             <wp:extent cx="3619500" cy="2819400"/>
             <wp:effectExtent l="0" t="0" r="0" b="0"/>
-            <wp:docPr id="1405994592" name="Imagen 1405994592"/>
+            <wp:docPr id="693279446" name="Imagen 693279446"/>
             <wp:cNvGraphicFramePr>
               <a:graphicFrameLocks xmlns:a="http://schemas.openxmlformats.org/drawingml/2006/main" noChangeAspect="1"/>
             </wp:cNvGraphicFramePr>
@@ -2799,10 +2985,10 @@
           <w:noProof/>
         </w:rPr>
         <w:drawing>
-          <wp:inline distT="0" distB="0" distL="0" distR="0" wp14:anchorId="6F84A484" wp14:editId="4EA856E9">
+          <wp:inline distT="0" distB="0" distL="0" distR="0" wp14:anchorId="6930F98F" wp14:editId="16E2BF30">
             <wp:extent cx="4953000" cy="2790825"/>
             <wp:effectExtent l="0" t="0" r="0" b="0"/>
-            <wp:docPr id="1570582447" name="Imagen 1570582447"/>
+            <wp:docPr id="1315441238" name="Imagen 1315441238"/>
             <wp:cNvGraphicFramePr>
               <a:graphicFrameLocks xmlns:a="http://schemas.openxmlformats.org/drawingml/2006/main" noChangeAspect="1"/>
             </wp:cNvGraphicFramePr>
@@ -2912,6 +3098,15 @@
     </w:p>
     <w:p>
       <w:pPr>
+        <w:spacing w:after="110" w:line="262" w:lineRule="auto"/>
+        <w:jc w:val="both"/>
+      </w:pPr>
+      <w:r>
+        <w:t>Cuando hay algo que decir sobre el plan de tu licorera, encima de los recuadros aparece una franja de aviso. Qué dice cada una y qué hacer con ella está en el capítulo 9.</w:t>
+      </w:r>
+    </w:p>
+    <w:p>
+      <w:pPr>
         <w:pStyle w:val="Ttulo2"/>
         <w:spacing w:before="150" w:after="80"/>
       </w:pPr>
@@ -3042,10 +3237,10 @@
           <w:noProof/>
         </w:rPr>
         <w:drawing>
-          <wp:inline distT="0" distB="0" distL="0" distR="0" wp14:anchorId="2B1B0555" wp14:editId="46A85BCE">
+          <wp:inline distT="0" distB="0" distL="0" distR="0" wp14:anchorId="13CD5EEB" wp14:editId="48BF25FA">
             <wp:extent cx="4953000" cy="2790825"/>
             <wp:effectExtent l="0" t="0" r="0" b="0"/>
-            <wp:docPr id="2100596201" name="Imagen 2100596201"/>
+            <wp:docPr id="1018242939" name="Imagen 1018242939"/>
             <wp:cNvGraphicFramePr>
               <a:graphicFrameLocks xmlns:a="http://schemas.openxmlformats.org/drawingml/2006/main" noChangeAspect="1"/>
             </wp:cNvGraphicFramePr>
@@ -3134,10 +3329,10 @@
           <w:noProof/>
         </w:rPr>
         <w:drawing>
-          <wp:inline distT="0" distB="0" distL="0" distR="0" wp14:anchorId="43D6C414" wp14:editId="212D0FBB">
+          <wp:inline distT="0" distB="0" distL="0" distR="0" wp14:anchorId="6820C208" wp14:editId="4BC0A16B">
             <wp:extent cx="6286500" cy="3533775"/>
             <wp:effectExtent l="0" t="0" r="0" b="0"/>
-            <wp:docPr id="1804807207" name="Imagen 1804807207"/>
+            <wp:docPr id="877648896" name="Imagen 877648896"/>
             <wp:cNvGraphicFramePr>
               <a:graphicFrameLocks xmlns:a="http://schemas.openxmlformats.org/drawingml/2006/main" noChangeAspect="1"/>
             </wp:cNvGraphicFramePr>
@@ -3365,10 +3560,10 @@
           <w:noProof/>
         </w:rPr>
         <w:drawing>
-          <wp:inline distT="0" distB="0" distL="0" distR="0" wp14:anchorId="58C131F4" wp14:editId="06A64040">
+          <wp:inline distT="0" distB="0" distL="0" distR="0" wp14:anchorId="37FD7105" wp14:editId="10E59CEB">
             <wp:extent cx="4953000" cy="2790825"/>
             <wp:effectExtent l="0" t="0" r="0" b="0"/>
-            <wp:docPr id="603886802" name="Imagen 603886802"/>
+            <wp:docPr id="507303547" name="Imagen 507303547"/>
             <wp:cNvGraphicFramePr>
               <a:graphicFrameLocks xmlns:a="http://schemas.openxmlformats.org/drawingml/2006/main" noChangeAspect="1"/>
             </wp:cNvGraphicFramePr>
@@ -3571,10 +3766,10 @@
           <w:noProof/>
         </w:rPr>
         <w:drawing>
-          <wp:inline distT="0" distB="0" distL="0" distR="0" wp14:anchorId="32FB8C3A" wp14:editId="773F50A7">
+          <wp:inline distT="0" distB="0" distL="0" distR="0" wp14:anchorId="53C19D84" wp14:editId="45C4A8FE">
             <wp:extent cx="6286500" cy="3533775"/>
             <wp:effectExtent l="0" t="0" r="0" b="0"/>
-            <wp:docPr id="674229879" name="Imagen 674229879"/>
+            <wp:docPr id="124927603" name="Imagen 124927603"/>
             <wp:cNvGraphicFramePr>
               <a:graphicFrameLocks xmlns:a="http://schemas.openxmlformats.org/drawingml/2006/main" noChangeAspect="1"/>
             </wp:cNvGraphicFramePr>
@@ -3735,10 +3930,10 @@
         </w:rPr>
         <w:lastRenderedPageBreak/>
         <w:drawing>
-          <wp:inline distT="0" distB="0" distL="0" distR="0" wp14:anchorId="530610BA" wp14:editId="2ABC855D">
+          <wp:inline distT="0" distB="0" distL="0" distR="0" wp14:anchorId="24940286" wp14:editId="5D3197E2">
             <wp:extent cx="6286500" cy="3533775"/>
             <wp:effectExtent l="0" t="0" r="0" b="0"/>
-            <wp:docPr id="2124166946" name="Imagen 2124166946"/>
+            <wp:docPr id="1448204633" name="Imagen 1448204633"/>
             <wp:cNvGraphicFramePr>
               <a:graphicFrameLocks xmlns:a="http://schemas.openxmlformats.org/drawingml/2006/main" noChangeAspect="1"/>
             </wp:cNvGraphicFramePr>
@@ -3831,9 +4026,655 @@
           <w:szCs w:val="27"/>
         </w:rPr>
         <w:lastRenderedPageBreak/>
-        <w:t>9. Mensajes del sistema</w:t>
+        <w:t>9. Tu suscripción</w:t>
       </w:r>
       <w:bookmarkEnd w:id="23"/>
+    </w:p>
+    <w:p>
+      <w:pPr>
+        <w:spacing w:after="110" w:line="262" w:lineRule="auto"/>
+        <w:jc w:val="both"/>
+      </w:pPr>
+      <w:r>
+        <w:t>Aquí se reúne todo lo que tiene que ver con el plan de tu licorera: cuál tienes, hasta cuándo está vigente, qué avisos vas a ver cuando se acerque la fecha y cómo cambiarlo. Este apartado es solo para administradores.</w:t>
+      </w:r>
+    </w:p>
+    <w:p>
+      <w:pPr>
+        <w:pStyle w:val="Ttulo2"/>
+        <w:spacing w:before="150" w:after="80"/>
+      </w:pPr>
+      <w:bookmarkStart w:id="24" w:name="bm25"/>
+      <w:r>
+        <w:rPr>
+          <w:b/>
+          <w:bCs/>
+          <w:color w:val="2E5496"/>
+          <w:sz w:val="23"/>
+          <w:szCs w:val="23"/>
+        </w:rPr>
+        <w:t>9.1 Tu plan y hasta cuándo está vigente</w:t>
+      </w:r>
+      <w:bookmarkEnd w:id="24"/>
+    </w:p>
+    <w:p>
+      <w:pPr>
+        <w:spacing w:after="110" w:line="262" w:lineRule="auto"/>
+        <w:jc w:val="both"/>
+      </w:pPr>
+      <w:r>
+        <w:t xml:space="preserve">En el panel principal, pulsa </w:t>
+      </w:r>
+      <w:r>
+        <w:rPr>
+          <w:b/>
+          <w:bCs/>
+        </w:rPr>
+        <w:t>Mi suscripción</w:t>
+      </w:r>
+      <w:r>
+        <w:t>. Esta pantalla no está en el menú de la izquierda, porque no es un módulo de trabajo diario.</w:t>
+      </w:r>
+    </w:p>
+    <w:p>
+      <w:pPr>
+        <w:spacing w:before="60" w:after="20"/>
+        <w:jc w:val="center"/>
+      </w:pPr>
+      <w:r>
+        <w:rPr>
+          <w:noProof/>
+        </w:rPr>
+        <w:drawing>
+          <wp:inline distT="0" distB="0" distL="0" distR="0" wp14:anchorId="529CA4B3" wp14:editId="5E673A92">
+            <wp:extent cx="6286500" cy="3533775"/>
+            <wp:effectExtent l="0" t="0" r="0" b="0"/>
+            <wp:docPr id="1078936404" name="Imagen 1078936404"/>
+            <wp:cNvGraphicFramePr>
+              <a:graphicFrameLocks xmlns:a="http://schemas.openxmlformats.org/drawingml/2006/main" noChangeAspect="1"/>
+            </wp:cNvGraphicFramePr>
+            <a:graphic xmlns:a="http://schemas.openxmlformats.org/drawingml/2006/main">
+              <a:graphicData uri="http://schemas.openxmlformats.org/drawingml/2006/picture">
+                <pic:pic xmlns:pic="http://schemas.openxmlformats.org/drawingml/2006/picture">
+                  <pic:nvPicPr>
+                    <pic:cNvPr id="0" name=""/>
+                    <pic:cNvPicPr>
+                      <a:picLocks noChangeAspect="1" noChangeArrowheads="1"/>
+                    </pic:cNvPicPr>
+                  </pic:nvPicPr>
+                  <pic:blipFill>
+                    <a:blip r:embed="rId17"/>
+                    <a:srcRect/>
+                    <a:stretch>
+                      <a:fillRect/>
+                    </a:stretch>
+                  </pic:blipFill>
+                  <pic:spPr bwMode="auto">
+                    <a:xfrm>
+                      <a:off x="0" y="0"/>
+                      <a:ext cx="6286500" cy="3533775"/>
+                    </a:xfrm>
+                    <a:prstGeom prst="rect">
+                      <a:avLst/>
+                    </a:prstGeom>
+                  </pic:spPr>
+                </pic:pic>
+              </a:graphicData>
+            </a:graphic>
+          </wp:inline>
+        </w:drawing>
+      </w:r>
+    </w:p>
+    <w:p>
+      <w:pPr>
+        <w:spacing w:before="6" w:after="150"/>
+        <w:jc w:val="center"/>
+      </w:pPr>
+      <w:r>
+        <w:rPr>
+          <w:i/>
+          <w:iCs/>
+          <w:color w:val="5B6678"/>
+          <w:sz w:val="18"/>
+          <w:szCs w:val="18"/>
+        </w:rPr>
+        <w:t>Figura 11. Mi suscripción: plan, vigencia y planes disponibles.</w:t>
+      </w:r>
+    </w:p>
+    <w:p>
+      <w:pPr>
+        <w:spacing w:after="110" w:line="262" w:lineRule="auto"/>
+        <w:jc w:val="both"/>
+      </w:pPr>
+      <w:r>
+        <w:t>Arriba, dos recuadros. El primero dice tu plan y su estado. El segundo, la fecha hasta la que está vigente y cuántos días quedan. Si la fecha ya pasó y estás en los días de gracia, ese segundo dato cambia de sentido y pasa a contar los días que faltan para la suspensión, que es la cifra que entonces importa.</w:t>
+      </w:r>
+    </w:p>
+    <w:p>
+      <w:pPr>
+        <w:spacing w:after="110" w:line="262" w:lineRule="auto"/>
+        <w:jc w:val="both"/>
+      </w:pPr>
+      <w:r>
+        <w:t>Debajo se listan los planes con lo que incluye cada uno. El tuyo lleva la marca «Tu plan» y no ofrece ningún botón. Los demás se comportan según la dirección del cambio, y de eso trata el apartado 9.3.</w:t>
+      </w:r>
+    </w:p>
+    <w:p>
+      <w:pPr>
+        <w:pStyle w:val="Ttulo2"/>
+        <w:spacing w:before="150" w:after="80"/>
+      </w:pPr>
+      <w:bookmarkStart w:id="25" w:name="bm26"/>
+      <w:r>
+        <w:rPr>
+          <w:b/>
+          <w:bCs/>
+          <w:color w:val="2E5496"/>
+          <w:sz w:val="23"/>
+          <w:szCs w:val="23"/>
+        </w:rPr>
+        <w:t>9.2 Los avisos del panel</w:t>
+      </w:r>
+      <w:bookmarkEnd w:id="25"/>
+    </w:p>
+    <w:p>
+      <w:pPr>
+        <w:spacing w:after="110" w:line="262" w:lineRule="auto"/>
+        <w:jc w:val="both"/>
+      </w:pPr>
+      <w:r>
+        <w:t>No hay que entrar a esta pantalla para enterarse de nada: cuando se acerca la fecha, el panel principal lo dice solo.</w:t>
+      </w:r>
+    </w:p>
+    <w:p>
+      <w:pPr>
+        <w:spacing w:after="110" w:line="262" w:lineRule="auto"/>
+        <w:jc w:val="both"/>
+      </w:pPr>
+      <w:r>
+        <w:rPr>
+          <w:b/>
+          <w:bCs/>
+        </w:rPr>
+        <w:t xml:space="preserve">Tres días antes. </w:t>
+      </w:r>
+      <w:r>
+        <w:t>Aparece un aviso en ámbar: «Tu plan vence en 2 días. Renuévalo para seguir registrando operaciones sin interrupción.» Todo sigue funcionando con normalidad.</w:t>
+      </w:r>
+    </w:p>
+    <w:p>
+      <w:pPr>
+        <w:spacing w:before="60" w:after="20"/>
+        <w:jc w:val="center"/>
+      </w:pPr>
+      <w:r>
+        <w:rPr>
+          <w:noProof/>
+        </w:rPr>
+        <w:lastRenderedPageBreak/>
+        <w:drawing>
+          <wp:inline distT="0" distB="0" distL="0" distR="0" wp14:anchorId="393EE12F" wp14:editId="3C51A25D">
+            <wp:extent cx="5334000" cy="3000375"/>
+            <wp:effectExtent l="0" t="0" r="0" b="0"/>
+            <wp:docPr id="699366436" name="Imagen 699366436"/>
+            <wp:cNvGraphicFramePr>
+              <a:graphicFrameLocks xmlns:a="http://schemas.openxmlformats.org/drawingml/2006/main" noChangeAspect="1"/>
+            </wp:cNvGraphicFramePr>
+            <a:graphic xmlns:a="http://schemas.openxmlformats.org/drawingml/2006/main">
+              <a:graphicData uri="http://schemas.openxmlformats.org/drawingml/2006/picture">
+                <pic:pic xmlns:pic="http://schemas.openxmlformats.org/drawingml/2006/picture">
+                  <pic:nvPicPr>
+                    <pic:cNvPr id="0" name=""/>
+                    <pic:cNvPicPr>
+                      <a:picLocks noChangeAspect="1" noChangeArrowheads="1"/>
+                    </pic:cNvPicPr>
+                  </pic:nvPicPr>
+                  <pic:blipFill>
+                    <a:blip r:embed="rId18"/>
+                    <a:srcRect/>
+                    <a:stretch>
+                      <a:fillRect/>
+                    </a:stretch>
+                  </pic:blipFill>
+                  <pic:spPr bwMode="auto">
+                    <a:xfrm>
+                      <a:off x="0" y="0"/>
+                      <a:ext cx="5334000" cy="3000375"/>
+                    </a:xfrm>
+                    <a:prstGeom prst="rect">
+                      <a:avLst/>
+                    </a:prstGeom>
+                  </pic:spPr>
+                </pic:pic>
+              </a:graphicData>
+            </a:graphic>
+          </wp:inline>
+        </w:drawing>
+      </w:r>
+    </w:p>
+    <w:p>
+      <w:pPr>
+        <w:spacing w:before="6" w:after="150"/>
+        <w:jc w:val="center"/>
+      </w:pPr>
+      <w:r>
+        <w:rPr>
+          <w:i/>
+          <w:iCs/>
+          <w:color w:val="5B6678"/>
+          <w:sz w:val="18"/>
+          <w:szCs w:val="18"/>
+        </w:rPr>
+        <w:t>Figura 12. Aviso de vencimiento próximo en el panel principal.</w:t>
+      </w:r>
+    </w:p>
+    <w:p>
+      <w:pPr>
+        <w:spacing w:after="110" w:line="262" w:lineRule="auto"/>
+        <w:jc w:val="both"/>
+      </w:pPr>
+      <w:r>
+        <w:rPr>
+          <w:b/>
+          <w:bCs/>
+        </w:rPr>
+        <w:t xml:space="preserve">Los cuatro días siguientes a la fecha. </w:t>
+      </w:r>
+      <w:r>
+        <w:t xml:space="preserve">Si la fecha pasa sin renovar, tu licorera </w:t>
+      </w:r>
+      <w:r>
+        <w:rPr>
+          <w:b/>
+          <w:bCs/>
+        </w:rPr>
+        <w:t>sigue funcionando cuatro días más</w:t>
+      </w:r>
+      <w:r>
+        <w:t xml:space="preserve"> con total normalidad. El aviso lo recuerda y sigue en ámbar, porque no hay nada roto: hay un plazo corriendo.</w:t>
+      </w:r>
+    </w:p>
+    <w:p>
+      <w:pPr>
+        <w:spacing w:before="60" w:after="20"/>
+        <w:jc w:val="center"/>
+      </w:pPr>
+      <w:r>
+        <w:rPr>
+          <w:noProof/>
+        </w:rPr>
+        <w:drawing>
+          <wp:inline distT="0" distB="0" distL="0" distR="0" wp14:anchorId="22CE9EE8" wp14:editId="6BB2EAF1">
+            <wp:extent cx="5334000" cy="3000375"/>
+            <wp:effectExtent l="0" t="0" r="0" b="0"/>
+            <wp:docPr id="1755621307" name="Imagen 1755621307"/>
+            <wp:cNvGraphicFramePr>
+              <a:graphicFrameLocks xmlns:a="http://schemas.openxmlformats.org/drawingml/2006/main" noChangeAspect="1"/>
+            </wp:cNvGraphicFramePr>
+            <a:graphic xmlns:a="http://schemas.openxmlformats.org/drawingml/2006/main">
+              <a:graphicData uri="http://schemas.openxmlformats.org/drawingml/2006/picture">
+                <pic:pic xmlns:pic="http://schemas.openxmlformats.org/drawingml/2006/picture">
+                  <pic:nvPicPr>
+                    <pic:cNvPr id="0" name=""/>
+                    <pic:cNvPicPr>
+                      <a:picLocks noChangeAspect="1" noChangeArrowheads="1"/>
+                    </pic:cNvPicPr>
+                  </pic:nvPicPr>
+                  <pic:blipFill>
+                    <a:blip r:embed="rId19"/>
+                    <a:srcRect/>
+                    <a:stretch>
+                      <a:fillRect/>
+                    </a:stretch>
+                  </pic:blipFill>
+                  <pic:spPr bwMode="auto">
+                    <a:xfrm>
+                      <a:off x="0" y="0"/>
+                      <a:ext cx="5334000" cy="3000375"/>
+                    </a:xfrm>
+                    <a:prstGeom prst="rect">
+                      <a:avLst/>
+                    </a:prstGeom>
+                  </pic:spPr>
+                </pic:pic>
+              </a:graphicData>
+            </a:graphic>
+          </wp:inline>
+        </w:drawing>
+      </w:r>
+    </w:p>
+    <w:p>
+      <w:pPr>
+        <w:spacing w:before="6" w:after="150"/>
+        <w:jc w:val="center"/>
+      </w:pPr>
+      <w:r>
+        <w:rPr>
+          <w:i/>
+          <w:iCs/>
+          <w:color w:val="5B6678"/>
+          <w:sz w:val="18"/>
+          <w:szCs w:val="18"/>
+        </w:rPr>
+        <w:t>Figura 13. Aviso durante los cuatro días de gracia.</w:t>
+      </w:r>
+    </w:p>
+    <w:p>
+      <w:pPr>
+        <w:spacing w:after="110" w:line="262" w:lineRule="auto"/>
+        <w:jc w:val="both"/>
+      </w:pPr>
+      <w:r>
+        <w:rPr>
+          <w:b/>
+          <w:bCs/>
+        </w:rPr>
+        <w:t xml:space="preserve">A partir del quinto día. </w:t>
+      </w:r>
+      <w:r>
+        <w:t>La suscripción queda suspendida y el aviso pasa a rojo. Aquí sí cambia lo que puedes hacer, y se explica en el apartado 9.4.</w:t>
+      </w:r>
+    </w:p>
+    <w:p>
+      <w:pPr>
+        <w:spacing w:before="60" w:after="20"/>
+        <w:jc w:val="center"/>
+      </w:pPr>
+      <w:r>
+        <w:rPr>
+          <w:noProof/>
+        </w:rPr>
+        <w:lastRenderedPageBreak/>
+        <w:drawing>
+          <wp:inline distT="0" distB="0" distL="0" distR="0" wp14:anchorId="49EC1663" wp14:editId="0123B11B">
+            <wp:extent cx="5334000" cy="3000375"/>
+            <wp:effectExtent l="0" t="0" r="0" b="0"/>
+            <wp:docPr id="1672150317" name="Imagen 1672150317"/>
+            <wp:cNvGraphicFramePr>
+              <a:graphicFrameLocks xmlns:a="http://schemas.openxmlformats.org/drawingml/2006/main" noChangeAspect="1"/>
+            </wp:cNvGraphicFramePr>
+            <a:graphic xmlns:a="http://schemas.openxmlformats.org/drawingml/2006/main">
+              <a:graphicData uri="http://schemas.openxmlformats.org/drawingml/2006/picture">
+                <pic:pic xmlns:pic="http://schemas.openxmlformats.org/drawingml/2006/picture">
+                  <pic:nvPicPr>
+                    <pic:cNvPr id="0" name=""/>
+                    <pic:cNvPicPr>
+                      <a:picLocks noChangeAspect="1" noChangeArrowheads="1"/>
+                    </pic:cNvPicPr>
+                  </pic:nvPicPr>
+                  <pic:blipFill>
+                    <a:blip r:embed="rId20"/>
+                    <a:srcRect/>
+                    <a:stretch>
+                      <a:fillRect/>
+                    </a:stretch>
+                  </pic:blipFill>
+                  <pic:spPr bwMode="auto">
+                    <a:xfrm>
+                      <a:off x="0" y="0"/>
+                      <a:ext cx="5334000" cy="3000375"/>
+                    </a:xfrm>
+                    <a:prstGeom prst="rect">
+                      <a:avLst/>
+                    </a:prstGeom>
+                  </pic:spPr>
+                </pic:pic>
+              </a:graphicData>
+            </a:graphic>
+          </wp:inline>
+        </w:drawing>
+      </w:r>
+    </w:p>
+    <w:p>
+      <w:pPr>
+        <w:spacing w:before="6" w:after="150"/>
+        <w:jc w:val="center"/>
+      </w:pPr>
+      <w:r>
+        <w:rPr>
+          <w:i/>
+          <w:iCs/>
+          <w:color w:val="5B6678"/>
+          <w:sz w:val="18"/>
+          <w:szCs w:val="18"/>
+        </w:rPr>
+        <w:t>Figura 14. Aviso de suscripción no vigente.</w:t>
+      </w:r>
+    </w:p>
+    <w:p>
+      <w:pPr>
+        <w:spacing w:after="110" w:line="262" w:lineRule="auto"/>
+        <w:jc w:val="both"/>
+      </w:pPr>
+      <w:r>
+        <w:rPr>
+          <w:b/>
+          <w:bCs/>
+        </w:rPr>
+        <w:t xml:space="preserve">El período de prueba no tiene días de gracia. </w:t>
+      </w:r>
+      <w:r>
+        <w:t>Los cuatro días son para un plan contratado que está pendiente de pago; una prueba gratuita que termina, termina.</w:t>
+      </w:r>
+    </w:p>
+    <w:p>
+      <w:pPr>
+        <w:spacing w:after="110" w:line="262" w:lineRule="auto"/>
+        <w:jc w:val="both"/>
+      </w:pPr>
+      <w:r>
+        <w:t>Cada vez que se registre una fecha de vencimiento nueva recibirás un correo con esa fecha. Si no es la que acordaste, avísanos: la fecha siempre la escribe una persona de INVENTRA, nunca se mueve sola.</w:t>
+      </w:r>
+    </w:p>
+    <w:p>
+      <w:pPr>
+        <w:pStyle w:val="Ttulo2"/>
+        <w:spacing w:before="150" w:after="80"/>
+      </w:pPr>
+      <w:bookmarkStart w:id="26" w:name="bm27"/>
+      <w:r>
+        <w:rPr>
+          <w:b/>
+          <w:bCs/>
+          <w:color w:val="2E5496"/>
+          <w:sz w:val="23"/>
+          <w:szCs w:val="23"/>
+        </w:rPr>
+        <w:t>9.3 Cambiar de plan</w:t>
+      </w:r>
+      <w:bookmarkEnd w:id="26"/>
+    </w:p>
+    <w:p>
+      <w:pPr>
+        <w:spacing w:after="110" w:line="262" w:lineRule="auto"/>
+        <w:jc w:val="both"/>
+      </w:pPr>
+      <w:r>
+        <w:t xml:space="preserve">Pasar a un plan más económico lo haces tú, porque no implica ningún cobro: en la tarjeta del plan aparece el botón </w:t>
+      </w:r>
+      <w:r>
+        <w:rPr>
+          <w:b/>
+          <w:bCs/>
+        </w:rPr>
+        <w:t>Cambiar al plan Básico</w:t>
+      </w:r>
+      <w:r>
+        <w:t>. Subir de plan se contrata con INVENTRA y lo activamos al confirmar el pago; por eso en esos planes no hay botón, sino la indicación de comunicarte con nosotros. No se esconde el plan superior: necesitas saber qué incluye y cómo se contrata.</w:t>
+      </w:r>
+    </w:p>
+    <w:p>
+      <w:pPr>
+        <w:spacing w:after="110" w:line="262" w:lineRule="auto"/>
+        <w:jc w:val="both"/>
+      </w:pPr>
+      <w:r>
+        <w:t>Antes de hacer el cambio se pide confirmación, con el detalle de lo que vas a perder. La fecha de vencimiento no se toca: el plan nuevo conserva la que ya tenías.</w:t>
+      </w:r>
+    </w:p>
+    <w:p>
+      <w:pPr>
+        <w:spacing w:before="60" w:after="20"/>
+        <w:jc w:val="center"/>
+      </w:pPr>
+      <w:r>
+        <w:rPr>
+          <w:noProof/>
+        </w:rPr>
+        <w:lastRenderedPageBreak/>
+        <w:drawing>
+          <wp:inline distT="0" distB="0" distL="0" distR="0" wp14:anchorId="514E03D1" wp14:editId="38F54CCF">
+            <wp:extent cx="6286500" cy="3533775"/>
+            <wp:effectExtent l="0" t="0" r="0" b="0"/>
+            <wp:docPr id="1982558688" name="Imagen 1982558688"/>
+            <wp:cNvGraphicFramePr>
+              <a:graphicFrameLocks xmlns:a="http://schemas.openxmlformats.org/drawingml/2006/main" noChangeAspect="1"/>
+            </wp:cNvGraphicFramePr>
+            <a:graphic xmlns:a="http://schemas.openxmlformats.org/drawingml/2006/main">
+              <a:graphicData uri="http://schemas.openxmlformats.org/drawingml/2006/picture">
+                <pic:pic xmlns:pic="http://schemas.openxmlformats.org/drawingml/2006/picture">
+                  <pic:nvPicPr>
+                    <pic:cNvPr id="0" name=""/>
+                    <pic:cNvPicPr>
+                      <a:picLocks noChangeAspect="1" noChangeArrowheads="1"/>
+                    </pic:cNvPicPr>
+                  </pic:nvPicPr>
+                  <pic:blipFill>
+                    <a:blip r:embed="rId21"/>
+                    <a:srcRect/>
+                    <a:stretch>
+                      <a:fillRect/>
+                    </a:stretch>
+                  </pic:blipFill>
+                  <pic:spPr bwMode="auto">
+                    <a:xfrm>
+                      <a:off x="0" y="0"/>
+                      <a:ext cx="6286500" cy="3533775"/>
+                    </a:xfrm>
+                    <a:prstGeom prst="rect">
+                      <a:avLst/>
+                    </a:prstGeom>
+                  </pic:spPr>
+                </pic:pic>
+              </a:graphicData>
+            </a:graphic>
+          </wp:inline>
+        </w:drawing>
+      </w:r>
+    </w:p>
+    <w:p>
+      <w:pPr>
+        <w:spacing w:before="6" w:after="150"/>
+        <w:jc w:val="center"/>
+      </w:pPr>
+      <w:r>
+        <w:rPr>
+          <w:i/>
+          <w:iCs/>
+          <w:color w:val="5B6678"/>
+          <w:sz w:val="18"/>
+          <w:szCs w:val="18"/>
+        </w:rPr>
+        <w:t>Figura 15. Confirmación antes de bajar de plan.</w:t>
+      </w:r>
+    </w:p>
+    <w:p>
+      <w:pPr>
+        <w:spacing w:after="110" w:line="262" w:lineRule="auto"/>
+        <w:jc w:val="both"/>
+      </w:pPr>
+      <w:r>
+        <w:rPr>
+          <w:b/>
+          <w:bCs/>
+        </w:rPr>
+        <w:t xml:space="preserve">Si no cabes en el plan nuevo, el botón no aparece. </w:t>
+      </w:r>
+      <w:r>
+        <w:t>En su lugar, la tarjeta explica por qué y con cifras: «el plan Básico admite un usuario y la licorera tiene 2 usuarios activos». No se ofrece una acción que vaya a ser rechazada, y el sistema no inactiva a nadie por su cuenta: esa decisión es del negocio. Inactiva lo que no necesites (apartado 7.4) y vuelve a entrar aquí.</w:t>
+      </w:r>
+    </w:p>
+    <w:p>
+      <w:pPr>
+        <w:spacing w:after="110" w:line="262" w:lineRule="auto"/>
+        <w:jc w:val="both"/>
+      </w:pPr>
+      <w:r>
+        <w:rPr>
+          <w:b/>
+          <w:bCs/>
+        </w:rPr>
+        <w:t xml:space="preserve">Durante los quince días de prueba no se cambia de plan. </w:t>
+      </w:r>
+      <w:r>
+        <w:t>La prueba ya es el plan Pro; eliges el tuyo cuando termina.</w:t>
+      </w:r>
+    </w:p>
+    <w:p>
+      <w:pPr>
+        <w:pStyle w:val="Ttulo2"/>
+        <w:spacing w:before="150" w:after="80"/>
+      </w:pPr>
+      <w:bookmarkStart w:id="27" w:name="bm28"/>
+      <w:r>
+        <w:rPr>
+          <w:b/>
+          <w:bCs/>
+          <w:color w:val="2E5496"/>
+          <w:sz w:val="23"/>
+          <w:szCs w:val="23"/>
+        </w:rPr>
+        <w:t>9.4 Si tu suscripción deja de estar vigente</w:t>
+      </w:r>
+      <w:bookmarkEnd w:id="27"/>
+    </w:p>
+    <w:p>
+      <w:pPr>
+        <w:spacing w:after="110" w:line="262" w:lineRule="auto"/>
+        <w:jc w:val="both"/>
+      </w:pPr>
+      <w:r>
+        <w:t xml:space="preserve">Tu información no se borra ni se oculta. Puedes entrar, consultarlo todo y seguir viendo tus datos; lo que el sistema deja de admitir es </w:t>
+      </w:r>
+      <w:r>
+        <w:rPr>
+          <w:b/>
+          <w:bCs/>
+        </w:rPr>
+        <w:t>registrar operaciones nuevas</w:t>
+      </w:r>
+      <w:r>
+        <w:t>: crear usuarios, cargar productos o registrar ventas. En las pantallas donde se registra algo, los botones desaparecen y en su lugar aparece el motivo con un enlace a esta pantalla.</w:t>
+      </w:r>
+    </w:p>
+    <w:p>
+      <w:pPr>
+        <w:spacing w:after="110" w:line="262" w:lineRule="auto"/>
+        <w:jc w:val="both"/>
+      </w:pPr>
+      <w:r>
+        <w:t>Lo que sí puedes hacer con la suscripción suspendida es cambiar de plan, precisamente para poder pasarte al que vas a pagar. En cuanto se registre la fecha nueva, todo vuelve a la normalidad sin que tengas que hacer nada más.</w:t>
+      </w:r>
+    </w:p>
+    <w:p>
+      <w:pPr>
+        <w:pStyle w:val="Ttulo1"/>
+        <w:pageBreakBefore/>
+        <w:spacing w:before="220" w:after="110"/>
+      </w:pPr>
+      <w:bookmarkStart w:id="28" w:name="bm29"/>
+      <w:r>
+        <w:rPr>
+          <w:b/>
+          <w:bCs/>
+          <w:color w:val="1F3864"/>
+          <w:sz w:val="27"/>
+          <w:szCs w:val="27"/>
+        </w:rPr>
+        <w:lastRenderedPageBreak/>
+        <w:t>10. Mensajes del sistema</w:t>
+      </w:r>
+      <w:bookmarkEnd w:id="28"/>
     </w:p>
     <w:p>
       <w:pPr>
@@ -3860,7 +4701,7 @@
           <w:left w:w="10" w:type="dxa"/>
           <w:right w:w="10" w:type="dxa"/>
         </w:tblCellMar>
-        <w:tblLook w:val="04A0" w:firstRow="1" w:lastRow="0" w:firstColumn="1" w:lastColumn="0" w:noHBand="0" w:noVBand="1"/>
+        <w:tblLook w:val="0000" w:firstRow="0" w:lastRow="0" w:firstColumn="0" w:lastColumn="0" w:noHBand="0" w:noVBand="0"/>
       </w:tblPr>
       <w:tblGrid>
         <w:gridCol w:w="2900"/>
@@ -4766,7 +5607,7 @@
         <w:pageBreakBefore/>
         <w:spacing w:before="220" w:after="110"/>
       </w:pPr>
-      <w:bookmarkStart w:id="24" w:name="bm25"/>
+      <w:bookmarkStart w:id="29" w:name="bm30"/>
       <w:r>
         <w:rPr>
           <w:b/>
@@ -4776,9 +5617,9 @@
           <w:szCs w:val="27"/>
         </w:rPr>
         <w:lastRenderedPageBreak/>
-        <w:t>10. Preguntas frecuentes</w:t>
-      </w:r>
-      <w:bookmarkEnd w:id="24"/>
+        <w:t>11. Preguntas frecuentes</w:t>
+      </w:r>
+      <w:bookmarkEnd w:id="29"/>
     </w:p>
     <w:p>
       <w:pPr>
@@ -4861,7 +5702,7 @@
       </w:r>
     </w:p>
     <w:sectPr>
-      <w:footerReference w:type="default" r:id="rId17"/>
+      <w:footerReference w:type="default" r:id="rId22"/>
       <w:pgSz w:w="12240" w:h="15840"/>
       <w:pgMar w:top="1080" w:right="1000" w:bottom="1080" w:left="1000" w:header="708" w:footer="708" w:gutter="0"/>
       <w:cols w:space="720"/>
@@ -4958,10 +5799,10 @@
 <file path=word/numbering.xml><?xml version="1.0" encoding="utf-8"?>
 <w:numbering xmlns:wpc="http://schemas.microsoft.com/office/word/2010/wordprocessingCanvas" xmlns:cx="http://schemas.microsoft.com/office/drawing/2014/chartex" xmlns:cx1="http://schemas.microsoft.com/office/drawing/2015/9/8/chartex" xmlns:cx2="http://schemas.microsoft.com/office/drawing/2015/10/21/chartex" xmlns:cx3="http://schemas.microsoft.com/office/drawing/2016/5/9/chartex" xmlns:cx4="http://schemas.microsoft.com/office/drawing/2016/5/10/chartex" xmlns:cx5="http://schemas.microsoft.com/office/drawing/2016/5/11/chartex" xmlns:cx6="http://schemas.microsoft.com/office/drawing/2016/5/12/chartex" xmlns:cx7="http://schemas.microsoft.com/office/drawing/2016/5/13/chartex" xmlns:cx8="http://schemas.microsoft.com/office/drawing/2016/5/14/chartex" xmlns:mc="http://schemas.openxmlformats.org/markup-compatibility/2006" xmlns:aink="http://schemas.microsoft.com/office/drawing/2016/ink" xmlns:am3d="http://schemas.microsoft.com/office/drawing/2017/model3d" xmlns:o="urn:schemas-microsoft-com:office:office" xmlns:oel="http://schemas.microsoft.com/office/2019/extlst" xmlns:r="http://schemas.openxmlformats.org/officeDocument/2006/relationships" xmlns:m="http://schemas.openxmlformats.org/officeDocument/2006/math" xmlns:v="urn:schemas-microsoft-com:vml" xmlns:wp14="http://schemas.microsoft.com/office/word/2010/wordprocessingDrawing" xmlns:wp="http://schemas.openxmlformats.org/drawingml/2006/wordprocessingDrawing" xmlns:w10="urn:schemas-microsoft-com:office:word" xmlns:w="http://schemas.openxmlformats.org/wordprocessingml/2006/main" xmlns:w14="http://schemas.microsoft.com/office/word/2010/wordml" xmlns:w15="http://schemas.microsoft.com/office/word/2012/wordml" xmlns:w16cex="http://schemas.microsoft.com/office/word/2018/wordml/cex" xmlns:w16cid="http://schemas.microsoft.com/office/word/2016/wordml/cid" xmlns:w16="http://schemas.microsoft.com/office/word/2018/wordml" xmlns:w16du="http://schemas.microsoft.com/office/word/2023/wordml/word16du" xmlns:w16sdtdh="http://schemas.microsoft.com/office/word/2020/wordml/sdtdatahash" xmlns:w16sdtfl="http://schemas.microsoft.com/office/word/2024/wordml/sdtformatlock" xmlns:w16se="http://schemas.microsoft.com/office/word/2015/wordml/symex" xmlns:wpg="http://schemas.microsoft.com/office/word/2010/wordprocessingGroup" xmlns:wpi="http://schemas.microsoft.com/office/word/2010/wordprocessingInk" xmlns:wne="http://schemas.microsoft.com/office/word/2006/wordml" xmlns:wps="http://schemas.microsoft.com/office/word/2010/wordprocessingShape" mc:Ignorable="w14 w15 w16se w16cid w16 w16cex w16sdtdh w16sdtfl w16du wp14">
   <w:abstractNum w:abstractNumId="0" w15:restartNumberingAfterBreak="0">
-    <w:nsid w:val="255F56AC"/>
+    <w:nsid w:val="008761B5"/>
     <w:multiLevelType w:val="hybridMultilevel"/>
-    <w:tmpl w:val="A88C8B0A"/>
-    <w:lvl w:ilvl="0" w:tplc="9C9450B0">
+    <w:tmpl w:val="629A1EE2"/>
+    <w:lvl w:ilvl="0" w:tplc="2CC27E7C">
       <w:start w:val="1"/>
       <w:numFmt w:val="decimal"/>
       <w:lvlText w:val="%1."/>
@@ -4970,52 +5811,52 @@
         <w:ind w:left="420" w:hanging="260"/>
       </w:pPr>
     </w:lvl>
-    <w:lvl w:ilvl="1" w:tplc="04022052">
+    <w:lvl w:ilvl="1" w:tplc="CC2C6D18">
       <w:numFmt w:val="decimal"/>
       <w:lvlText w:val=""/>
       <w:lvlJc w:val="left"/>
     </w:lvl>
-    <w:lvl w:ilvl="2" w:tplc="2BFE2E98">
+    <w:lvl w:ilvl="2" w:tplc="AC909ADE">
       <w:numFmt w:val="decimal"/>
       <w:lvlText w:val=""/>
       <w:lvlJc w:val="left"/>
     </w:lvl>
-    <w:lvl w:ilvl="3" w:tplc="FF2CEE00">
+    <w:lvl w:ilvl="3" w:tplc="E40E69BC">
       <w:numFmt w:val="decimal"/>
       <w:lvlText w:val=""/>
       <w:lvlJc w:val="left"/>
     </w:lvl>
-    <w:lvl w:ilvl="4" w:tplc="1E5AC71E">
+    <w:lvl w:ilvl="4" w:tplc="D24C2BDC">
       <w:numFmt w:val="decimal"/>
       <w:lvlText w:val=""/>
       <w:lvlJc w:val="left"/>
     </w:lvl>
-    <w:lvl w:ilvl="5" w:tplc="7BF02138">
+    <w:lvl w:ilvl="5" w:tplc="2326EA5C">
       <w:numFmt w:val="decimal"/>
       <w:lvlText w:val=""/>
       <w:lvlJc w:val="left"/>
     </w:lvl>
-    <w:lvl w:ilvl="6" w:tplc="E3F60BBA">
+    <w:lvl w:ilvl="6" w:tplc="77E62EA2">
       <w:numFmt w:val="decimal"/>
       <w:lvlText w:val=""/>
       <w:lvlJc w:val="left"/>
     </w:lvl>
-    <w:lvl w:ilvl="7" w:tplc="22A20D28">
+    <w:lvl w:ilvl="7" w:tplc="59EAFBB6">
       <w:numFmt w:val="decimal"/>
       <w:lvlText w:val=""/>
       <w:lvlJc w:val="left"/>
     </w:lvl>
-    <w:lvl w:ilvl="8" w:tplc="170C9EB8">
+    <w:lvl w:ilvl="8" w:tplc="35321BF4">
       <w:numFmt w:val="decimal"/>
       <w:lvlText w:val=""/>
       <w:lvlJc w:val="left"/>
     </w:lvl>
   </w:abstractNum>
   <w:abstractNum w:abstractNumId="1" w15:restartNumberingAfterBreak="0">
-    <w:nsid w:val="5723309E"/>
+    <w:nsid w:val="07BE4376"/>
     <w:multiLevelType w:val="hybridMultilevel"/>
-    <w:tmpl w:val="2200A7E6"/>
-    <w:lvl w:ilvl="0" w:tplc="9058EDF0">
+    <w:tmpl w:val="3008E91C"/>
+    <w:lvl w:ilvl="0" w:tplc="769E1ED6">
       <w:start w:val="1"/>
       <w:numFmt w:val="bullet"/>
       <w:lvlText w:val="●"/>
@@ -5024,7 +5865,7 @@
         <w:ind w:left="720" w:hanging="360"/>
       </w:pPr>
     </w:lvl>
-    <w:lvl w:ilvl="1" w:tplc="D32A9004">
+    <w:lvl w:ilvl="1" w:tplc="7FB8500E">
       <w:start w:val="1"/>
       <w:numFmt w:val="bullet"/>
       <w:lvlText w:val="○"/>
@@ -5033,7 +5874,7 @@
         <w:ind w:left="1440" w:hanging="360"/>
       </w:pPr>
     </w:lvl>
-    <w:lvl w:ilvl="2" w:tplc="802462D8">
+    <w:lvl w:ilvl="2" w:tplc="89C03406">
       <w:start w:val="1"/>
       <w:numFmt w:val="bullet"/>
       <w:lvlText w:val="■"/>
@@ -5042,7 +5883,7 @@
         <w:ind w:left="2160" w:hanging="360"/>
       </w:pPr>
     </w:lvl>
-    <w:lvl w:ilvl="3" w:tplc="867485FA">
+    <w:lvl w:ilvl="3" w:tplc="5A62BB38">
       <w:start w:val="1"/>
       <w:numFmt w:val="bullet"/>
       <w:lvlText w:val="●"/>
@@ -5051,7 +5892,7 @@
         <w:ind w:left="2880" w:hanging="360"/>
       </w:pPr>
     </w:lvl>
-    <w:lvl w:ilvl="4" w:tplc="3DCE8B1A">
+    <w:lvl w:ilvl="4" w:tplc="D8D4F5B4">
       <w:start w:val="1"/>
       <w:numFmt w:val="bullet"/>
       <w:lvlText w:val="○"/>
@@ -5060,7 +5901,7 @@
         <w:ind w:left="3600" w:hanging="360"/>
       </w:pPr>
     </w:lvl>
-    <w:lvl w:ilvl="5" w:tplc="108E7810">
+    <w:lvl w:ilvl="5" w:tplc="B3CE9A52">
       <w:start w:val="1"/>
       <w:numFmt w:val="bullet"/>
       <w:lvlText w:val="■"/>
@@ -5069,7 +5910,7 @@
         <w:ind w:left="4320" w:hanging="360"/>
       </w:pPr>
     </w:lvl>
-    <w:lvl w:ilvl="6" w:tplc="9D6A9026">
+    <w:lvl w:ilvl="6" w:tplc="AAB8D09C">
       <w:start w:val="1"/>
       <w:numFmt w:val="bullet"/>
       <w:lvlText w:val="●"/>
@@ -5078,7 +5919,7 @@
         <w:ind w:left="5040" w:hanging="360"/>
       </w:pPr>
     </w:lvl>
-    <w:lvl w:ilvl="7" w:tplc="7DC09950">
+    <w:lvl w:ilvl="7" w:tplc="AF60A5EC">
       <w:start w:val="1"/>
       <w:numFmt w:val="bullet"/>
       <w:lvlText w:val="●"/>
@@ -5087,7 +5928,7 @@
         <w:ind w:left="5760" w:hanging="360"/>
       </w:pPr>
     </w:lvl>
-    <w:lvl w:ilvl="8" w:tplc="344CAD68">
+    <w:lvl w:ilvl="8" w:tplc="E22897B6">
       <w:start w:val="1"/>
       <w:numFmt w:val="bullet"/>
       <w:lvlText w:val="●"/>
@@ -5097,13 +5938,13 @@
       </w:pPr>
     </w:lvl>
   </w:abstractNum>
-  <w:num w:numId="1" w16cid:durableId="331835042">
+  <w:num w:numId="1" w16cid:durableId="534076011">
     <w:abstractNumId w:val="1"/>
     <w:lvlOverride w:ilvl="0">
       <w:startOverride w:val="1"/>
     </w:lvlOverride>
   </w:num>
-  <w:num w:numId="2" w16cid:durableId="1302929994">
+  <w:num w:numId="2" w16cid:durableId="1839923276">
     <w:abstractNumId w:val="0"/>
     <w:lvlOverride w:ilvl="0">
       <w:startOverride w:val="1"/>

</xml_diff>